<commit_message>
Define as datas de faturamento e pagamento
Nota fiscal até o 3º dia útil e pagamento até o 5º dia útil de cada mês,
deixando dois dias entre a entrega da documentação e a liquidação.

Co-Authored-By: Claude Opus 5 <noreply@anthropic.com>
Claude-Session: https://claude.ai/code/session_01JvuJwy7yY4EnoYMkQynCaG
</commit_message>
<xml_diff>
--- a/docs/juridico/contrato-leve-zeladoria.docx
+++ b/docs/juridico/contrato-leve-zeladoria.docx
@@ -959,13 +959,13 @@
         <w:rPr>
           <w:b w:val="0"/>
         </w:rPr>
-        <w:t xml:space="preserve"> Até o dia </w:t>
+        <w:t xml:space="preserve"> Até o </w:t>
       </w:r>
       <w:r>
         <w:rPr>
           <w:b/>
         </w:rPr>
-        <w:t>[__]</w:t>
+        <w:t>3º (terceiro) dia útil</w:t>
       </w:r>
       <w:r>
         <w:rPr>
@@ -1009,19 +1009,19 @@
         <w:rPr>
           <w:b w:val="0"/>
         </w:rPr>
-        <w:t xml:space="preserve"> O pagamento será feito até o dia </w:t>
+        <w:t xml:space="preserve"> O pagamento será feito até o </w:t>
       </w:r>
       <w:r>
         <w:rPr>
           <w:b/>
         </w:rPr>
-        <w:t>[__]</w:t>
+        <w:t>5º (quinto) dia útil</w:t>
       </w:r>
       <w:r>
         <w:rPr>
           <w:b w:val="0"/>
         </w:rPr>
-        <w:t xml:space="preserve">, por transferência ou PIX para </w:t>
+        <w:t xml:space="preserve"> de cada mês, por transferência ou PIX para </w:t>
       </w:r>
       <w:r>
         <w:rPr>

</xml_diff>

<commit_message>
Preenche contato, cozinha e despesas da Casa de Operações
- Contato da Contratada conforme cartão CNPJ.
- Café da manhã preparado na copa da cozinha do empreendimento, ao lado
  da recepção, sob a licença sanitária da Contratante, com obrigação de
  higienizar a área após cada uso.
- Nova Cláusula 9.7: energia, água e internet por conta da Contratante,
  por estarem as instalações ligadas às redes do empreendimento, com a
  mesma natureza instrumental da cessão e sem integrar o preço; limpeza
  interna e uso moderado por conta da Contratada.

Co-Authored-By: Claude Opus 5 <noreply@anthropic.com>
Claude-Session: https://claude.ai/code/session_01JvuJwy7yY4EnoYMkQynCaG
</commit_message>
<xml_diff>
--- a/docs/juridico/contrato-leve-zeladoria.docx
+++ b/docs/juridico/contrato-leve-zeladoria.docx
@@ -1283,19 +1283,19 @@
         <w:rPr>
           <w:b w:val="0"/>
         </w:rPr>
-        <w:t xml:space="preserve">Os alimentos serão preparados em </w:t>
+        <w:t xml:space="preserve">Os alimentos serão preparados na </w:t>
       </w:r>
       <w:r>
         <w:rPr>
           <w:b/>
         </w:rPr>
-        <w:t>[ ( ) cozinha do empreendimento / ( ) estabelecimento próprio da CONTRATADA ]</w:t>
+        <w:t>copa da cozinha do empreendimento, ao lado da recepção</w:t>
       </w:r>
       <w:r>
         <w:rPr>
           <w:b w:val="0"/>
         </w:rPr>
-        <w:t>.</w:t>
+        <w:t>, sob a licença sanitária da CONTRATANTE, cabendo à CONTRATADA operar esse espaço em conformidade com as regras acima e manter a área e os equipamentos higienizados após cada uso.</w:t>
       </w:r>
     </w:p>
     <w:p>
@@ -1699,7 +1699,45 @@
         <w:rPr>
           <w:b/>
         </w:rPr>
-        <w:t>9.7.</w:t>
+        <w:t>9.7. Despesas de consumo.</w:t>
+      </w:r>
+      <w:r>
+        <w:rPr>
+          <w:b w:val="0"/>
+        </w:rPr>
+        <w:t xml:space="preserve"> As instalações da unidade estão ligadas às redes do próprio empreendimento, razão pela qual </w:t>
+      </w:r>
+      <w:r>
+        <w:rPr>
+          <w:b/>
+        </w:rPr>
+        <w:t>energia elétrica, água e internet correm por conta da CONTRATANTE</w:t>
+      </w:r>
+      <w:r>
+        <w:rPr>
+          <w:b w:val="0"/>
+        </w:rPr>
+        <w:t xml:space="preserve">, como parte da infraestrutura operacional cedida junto com a unidade. Essas despesas seguem a mesma natureza da cessão: são </w:t>
+      </w:r>
+      <w:r>
+        <w:rPr>
+          <w:b/>
+        </w:rPr>
+        <w:t>instrumentais à prestação, e não pagamento, benefício ou parcela remuneratória</w:t>
+      </w:r>
+      <w:r>
+        <w:rPr>
+          <w:b w:val="0"/>
+        </w:rPr>
+        <w:t>, não tendo sido consideradas na formação do preço da Cláusula 6.1. A limpeza e a conservação interna da unidade ficam por conta da CONTRATADA, que se obriga ao uso moderado dos serviços, desligando equipamentos quando ausente e comunicando de imediato qualquer vazamento ou falha.</w:t>
+      </w:r>
+    </w:p>
+    <w:p>
+      <w:r>
+        <w:rPr>
+          <w:b/>
+        </w:rPr>
+        <w:t>9.8.</w:t>
       </w:r>
       <w:r>
         <w:rPr>
@@ -2071,7 +2109,7 @@
         <w:rPr>
           <w:b w:val="0"/>
         </w:rPr>
-        <w:t xml:space="preserve"> — [e-mail], [telefone].</w:t>
+        <w:t xml:space="preserve"> — camila.consultoriamk@gmail.com, (48) 9223-2826.</w:t>
       </w:r>
     </w:p>
     <w:p>

</xml_diff>

<commit_message>
Cria o checklist de regularização anterior à assinatura
Reúne num documento encaminhável à Contratada e ao contador dela as
condições que sustentam a contratação por pessoa jurídica: sede do CNPJ
em endereço distinto do empreendimento, CNAE principal compatível, conta
e chave PIX da empresa, e formalização do cônjuge que atua no local.
Inclui a rotina mensal de documentos, os cuidados de coordenação da
Contratante e as pendências que faltam no contrato.

A Cláusula 4.4 passa a exigir também conta e chave PIX em nome da
empresa, e autoriza a retenção dos pagamentos enquanto a regularização
estiver pendente.

Co-Authored-By: Claude Opus 5 <noreply@anthropic.com>
Claude-Session: https://claude.ai/code/session_01JvuJwy7yY4EnoYMkQynCaG
</commit_message>
<xml_diff>
--- a/docs/juridico/contrato-leve-zeladoria.docx
+++ b/docs/juridico/contrato-leve-zeladoria.docx
@@ -783,7 +783,31 @@
         <w:rPr>
           <w:b w:val="0"/>
         </w:rPr>
-        <w:t>, o cadastro do seu CNPJ, com sede em endereço próprio e atividade principal compatível com o objeto (CNAE 81.21-4-00 ou 81.29-0-00).</w:t>
+        <w:t xml:space="preserve"> contados da assinatura, o cadastro do seu CNPJ, com </w:t>
+      </w:r>
+      <w:r>
+        <w:rPr>
+          <w:b/>
+        </w:rPr>
+        <w:t>sede em endereço próprio e distinto do empreendimento</w:t>
+      </w:r>
+      <w:r>
+        <w:rPr>
+          <w:b w:val="0"/>
+        </w:rPr>
+        <w:t xml:space="preserve"> e atividade principal compatível com o objeto (CNAE 81.21-4-00 ou 81.29-0-00), e manterá </w:t>
+      </w:r>
+      <w:r>
+        <w:rPr>
+          <w:b/>
+        </w:rPr>
+        <w:t>conta bancária e chave PIX em nome da empresa</w:t>
+      </w:r>
+      <w:r>
+        <w:rPr>
+          <w:b w:val="0"/>
+        </w:rPr>
+        <w:t>, para recebimento na forma da Cláusula 6.3. Enquanto pendente a regularização, a CONTRATANTE poderá reter os pagamentos, sem que isso configure atraso.</w:t>
       </w:r>
     </w:p>
     <w:p>

</xml_diff>

<commit_message>
Substitui a taxa de ocupação por multa diária de atraso
A taxa mensal soava como aluguel e exigia uma pesquisa de valor de
mercado que não existe. A cláusula passa a prever multa de R$ 100,00 por
dia de atraso na devolução, com a ressalva expressa de que nada é devido
se a unidade for entregue no prazo.

Co-Authored-By: Claude Opus 5 <noreply@anthropic.com>
Claude-Session: https://claude.ai/code/session_01JvuJwy7yY4EnoYMkQynCaG
</commit_message>
<xml_diff>
--- a/docs/juridico/contrato-leve-zeladoria.docx
+++ b/docs/juridico/contrato-leve-zeladoria.docx
@@ -1843,19 +1843,25 @@
         <w:rPr>
           <w:b w:val="0"/>
         </w:rPr>
-        <w:t xml:space="preserve"> Passados os 30 (trinta) dias, será devida uma </w:t>
+        <w:t xml:space="preserve"> Passados os 30 (trinta) dias sem a devolução, será devida </w:t>
       </w:r>
       <w:r>
         <w:rPr>
           <w:b/>
         </w:rPr>
-        <w:t>taxa de ocupação de R$ [______] por mês</w:t>
+        <w:t>multa de R$ 100,00 (cem reais) por dia de atraso</w:t>
       </w:r>
       <w:r>
         <w:rPr>
           <w:b w:val="0"/>
         </w:rPr>
-        <w:t>, calculada por dia, e a CONTRATANTE poderá retomar o imóvel judicialmente, correndo por conta da CONTRATADA as despesas dessa retomada.</w:t>
+        <w:t xml:space="preserve">, até a efetiva desocupação, podendo a CONTRATANTE retomar o imóvel judicialmente, com as despesas dessa retomada por conta da CONTRATADA. </w:t>
+      </w:r>
+      <w:r>
+        <w:rPr>
+          <w:b/>
+        </w:rPr>
+        <w:t>Devolvida a unidade no prazo, nada é devido.</w:t>
       </w:r>
     </w:p>
     <w:p>

</xml_diff>

<commit_message>
Atribui à Contratada a supervisão e o controle da operação
Registra que ela supervisiona, controla e executa o necessário à entrega
dos serviços — equipe, padrão, rotinas, insumos, atendimento e
conservação — e responde pelo resultado no escopo contratado, com dever
de comunicar o que estiver fora da sua alçada.

As decisões de negócio seguem com a Contratante: preços, política de
reservas, cortesias, fornecedores, investimentos e representação.

A declaração conjunta passa a mencionar essa responsabilidade, que
reforça a autonomia empresarial da Contratada.

Co-Authored-By: Claude Opus 5 <noreply@anthropic.com>
Claude-Session: https://claude.ai/code/session_01JvuJwy7yY4EnoYMkQynCaG
</commit_message>
<xml_diff>
--- a/docs/juridico/contrato-leve-zeladoria.docx
+++ b/docs/juridico/contrato-leve-zeladoria.docx
@@ -255,25 +255,67 @@
       </w:r>
     </w:p>
     <w:p>
-      <w:pPr>
-        <w:pBdr>
-          <w:bottom w:val="single" w:sz="6" w:color="C9A84C"/>
-        </w:pBdr>
-      </w:pPr>
+      <w:r>
+        <w:rPr>
+          <w:b/>
+        </w:rPr>
+        <w:t>1.5. Supervisão, controle e execução.</w:t>
+      </w:r>
+      <w:r>
+        <w:rPr>
+          <w:b w:val="0"/>
+        </w:rPr>
+        <w:t xml:space="preserve"> Cabe à CONTRATADA </w:t>
+      </w:r>
+      <w:r>
+        <w:rPr>
+          <w:b/>
+        </w:rPr>
+        <w:t>supervisionar, controlar e executar</w:t>
+      </w:r>
+      <w:r>
+        <w:rPr>
+          <w:b w:val="0"/>
+        </w:rPr>
+        <w:t>, por sua conta e no exercício de sua autonomia, tudo o que for necessário à entrega dos serviços deste contrato: a organização e a direção da própria equipe; o padrão e a qualidade do que é entregue; as rotinas de trabalho e a ordem de execução; o controle dos insumos, do enxoval e dos materiais sob sua guarda; o atendimento ao hóspede no que lhe compete; a conservação das instalações; e a verificação diária de que o empreendimento está em condições de receber e manter hóspedes.</w:t>
+      </w:r>
     </w:p>
     <w:p>
-      <w:pPr>
-        <w:keepNext/>
-        <w:spacing w:before="360" w:after="160"/>
-        <w:jc w:val="left"/>
-      </w:pPr>
       <w:r>
         <w:rPr>
           <w:b/>
-          <w:color w:val="C9A84C"/>
-          <w:sz w:val="25"/>
-        </w:rPr>
-        <w:t>2. HORÁRIO DE ATENDIMENTO DO EMPREENDIMENTO</w:t>
+        </w:rPr>
+        <w:t>1.5.1.</w:t>
+      </w:r>
+      <w:r>
+        <w:rPr>
+          <w:b w:val="0"/>
+        </w:rPr>
+        <w:t xml:space="preserve"> A CONTRATADA é a </w:t>
+      </w:r>
+      <w:r>
+        <w:rPr>
+          <w:b/>
+        </w:rPr>
+        <w:t>responsável pelo resultado</w:t>
+      </w:r>
+      <w:r>
+        <w:rPr>
+          <w:b w:val="0"/>
+        </w:rPr>
+        <w:t xml:space="preserve"> da operação dentro do escopo contratado e responde por sua condução perante a CONTRATANTE. Obriga-se a </w:t>
+      </w:r>
+      <w:r>
+        <w:rPr>
+          <w:b/>
+        </w:rPr>
+        <w:t>comunicar de imediato</w:t>
+      </w:r>
+      <w:r>
+        <w:rPr>
+          <w:b w:val="0"/>
+        </w:rPr>
+        <w:t xml:space="preserve"> o que estiver fora da sua alçada: falha que exija profissional habilitado, ocorrência de segurança, dano relevante, risco a hóspede ou situação que dependa de decisão da CONTRATANTE.</w:t>
       </w:r>
     </w:p>
     <w:p>
@@ -281,269 +323,25 @@
         <w:rPr>
           <w:b/>
         </w:rPr>
-        <w:t>2.1.</w:t>
+        <w:t>1.5.2.</w:t>
       </w:r>
       <w:r>
         <w:rPr>
           <w:b w:val="0"/>
         </w:rPr>
-        <w:t xml:space="preserve"> O empreendimento recebe hóspedes </w:t>
+        <w:t xml:space="preserve"> Permanecem com a CONTRATANTE as </w:t>
       </w:r>
       <w:r>
         <w:rPr>
           <w:b/>
         </w:rPr>
-        <w:t>das 7h30 às 19h00, todos os dias</w:t>
+        <w:t>decisões de negócio</w:t>
       </w:r>
       <w:r>
         <w:rPr>
           <w:b w:val="0"/>
         </w:rPr>
-        <w:t xml:space="preserve">. A CONTRATADA se compromete a </w:t>
-      </w:r>
-      <w:r>
-        <w:rPr>
-          <w:b/>
-        </w:rPr>
-        <w:t>manter esse período coberto</w:t>
-      </w:r>
-      <w:r>
-        <w:rPr>
-          <w:b w:val="0"/>
-        </w:rPr>
-        <w:t>, com ao menos uma pessoa qualificada e apta a atender, reforçando a equipe quando a ocupação exigir.</w:t>
-      </w:r>
-    </w:p>
-    <w:p>
-      <w:r>
-        <w:rPr>
-          <w:b/>
-        </w:rPr>
-        <w:t>2.2.</w:t>
-      </w:r>
-      <w:r>
-        <w:rPr>
-          <w:b w:val="0"/>
-        </w:rPr>
-        <w:t xml:space="preserve"> Esse período é o </w:t>
-      </w:r>
-      <w:r>
-        <w:rPr>
-          <w:b/>
-        </w:rPr>
-        <w:t>horário de funcionamento do empreendimento</w:t>
-      </w:r>
-      <w:r>
-        <w:rPr>
-          <w:b w:val="0"/>
-        </w:rPr>
-        <w:t xml:space="preserve"> e define o resultado esperado do serviço — não é jornada, escala ou expediente de ninguém.</w:t>
-      </w:r>
-    </w:p>
-    <w:p>
-      <w:r>
-        <w:rPr>
-          <w:b/>
-        </w:rPr>
-        <w:t>2.3.</w:t>
-      </w:r>
-      <w:r>
-        <w:rPr>
-          <w:b w:val="0"/>
-        </w:rPr>
-        <w:t xml:space="preserve"> Cabe </w:t>
-      </w:r>
-      <w:r>
-        <w:rPr>
-          <w:b/>
-        </w:rPr>
-        <w:t>à CONTRATADA</w:t>
-      </w:r>
-      <w:r>
-        <w:rPr>
-          <w:b w:val="0"/>
-        </w:rPr>
-        <w:t xml:space="preserve"> organizar como cobre esse período: quem trabalha em cada momento, o revezamento da equipe, os intervalos, os descansos, as folgas, o tamanho do time e as substituições. Essas decisões são dela, e podem mudar quando ela quiser.</w:t>
-      </w:r>
-    </w:p>
-    <w:p>
-      <w:r>
-        <w:rPr>
-          <w:b/>
-        </w:rPr>
-        <w:t>2.4.</w:t>
-      </w:r>
-      <w:r>
-        <w:rPr>
-          <w:b w:val="0"/>
-        </w:rPr>
-        <w:t xml:space="preserve"> </w:t>
-      </w:r>
-      <w:r>
-        <w:rPr>
-          <w:b/>
-        </w:rPr>
-        <w:t>Não há, para a CONTRATADA ou para qualquer pessoa de sua equipe, dia ou horário fixo de início e término.</w:t>
-      </w:r>
-      <w:r>
-        <w:rPr>
-          <w:b w:val="0"/>
-        </w:rPr>
-        <w:t xml:space="preserve"> A CONTRATANTE não exige a presença pessoal da titular, não escolhe quem cobre cada período, não marca horário de entrada ou de saída de ninguém, não controla tempo de permanência e não registra frequência. A obrigação assumida é da </w:t>
-      </w:r>
-      <w:r>
-        <w:rPr>
-          <w:b/>
-        </w:rPr>
-        <w:t>empresa</w:t>
-      </w:r>
-      <w:r>
-        <w:rPr>
-          <w:b w:val="0"/>
-        </w:rPr>
-        <w:t>, e consiste em manter o atendimento coberto.</w:t>
-      </w:r>
-    </w:p>
-    <w:p>
-      <w:r>
-        <w:rPr>
-          <w:b/>
-        </w:rPr>
-        <w:t>2.5.</w:t>
-      </w:r>
-      <w:r>
-        <w:rPr>
-          <w:b w:val="0"/>
-        </w:rPr>
-        <w:t xml:space="preserve"> Fora desse período, eventuais chegadas tardias ou intercorrências serão atendidas conforme disponibilidade organizada pela própria CONTRATADA, já compreendida no preço.</w:t>
-      </w:r>
-    </w:p>
-    <w:p>
-      <w:r>
-        <w:rPr>
-          <w:b/>
-        </w:rPr>
-        <w:t>2.6. Plano de Cobertura.</w:t>
-      </w:r>
-      <w:r>
-        <w:rPr>
-          <w:b w:val="0"/>
-        </w:rPr>
-        <w:t xml:space="preserve"> Para dar previsibilidade à operação, a CONTRATADA apresentará à CONTRATANTE, na assinatura deste contrato e sempre que houver alteração, um </w:t>
-      </w:r>
-      <w:r>
-        <w:rPr>
-          <w:b/>
-        </w:rPr>
-        <w:t>Plano de Cobertura</w:t>
-      </w:r>
-      <w:r>
-        <w:rPr>
-          <w:b w:val="0"/>
-        </w:rPr>
-        <w:t xml:space="preserve"> por escrito, indicando </w:t>
-      </w:r>
-      <w:r>
-        <w:rPr>
-          <w:b/>
-        </w:rPr>
-        <w:t>como pretende cobrir o horário de atendimento</w:t>
-      </w:r>
-      <w:r>
-        <w:rPr>
-          <w:b w:val="0"/>
-        </w:rPr>
-        <w:t>: os períodos, as pessoas designadas para cada um, o revezamento previsto e quem responde em cada momento.</w:t>
-      </w:r>
-    </w:p>
-    <w:p>
-      <w:r>
-        <w:rPr>
-          <w:b/>
-        </w:rPr>
-        <w:t>2.6.1.</w:t>
-      </w:r>
-      <w:r>
-        <w:rPr>
-          <w:b w:val="0"/>
-        </w:rPr>
-        <w:t xml:space="preserve"> O Plano é </w:t>
-      </w:r>
-      <w:r>
-        <w:rPr>
-          <w:b/>
-        </w:rPr>
-        <w:t>elaborado pela CONTRATADA</w:t>
-      </w:r>
-      <w:r>
-        <w:rPr>
-          <w:b w:val="0"/>
-        </w:rPr>
-        <w:t xml:space="preserve">, que pode alterá-lo sempre que entender necessário, bastando comunicar a CONTRATANTE. A CONTRATANTE </w:t>
-      </w:r>
-      <w:r>
-        <w:rPr>
-          <w:b/>
-        </w:rPr>
-        <w:t>não aprova, não altera e não define</w:t>
-      </w:r>
-      <w:r>
-        <w:rPr>
-          <w:b w:val="0"/>
-        </w:rPr>
-        <w:t xml:space="preserve"> o conteúdo do Plano: apenas confere se ele atende à cobertura contratada na Cláusula 2.1 e registra o recebimento.</w:t>
-      </w:r>
-    </w:p>
-    <w:p>
-      <w:r>
-        <w:rPr>
-          <w:b/>
-        </w:rPr>
-        <w:t>2.6.2.</w:t>
-      </w:r>
-      <w:r>
-        <w:rPr>
-          <w:b w:val="0"/>
-        </w:rPr>
-        <w:t xml:space="preserve"> O Plano vale como </w:t>
-      </w:r>
-      <w:r>
-        <w:rPr>
-          <w:b/>
-        </w:rPr>
-        <w:t>compromisso da empresa CONTRATADA</w:t>
-      </w:r>
-      <w:r>
-        <w:rPr>
-          <w:b w:val="0"/>
-        </w:rPr>
-        <w:t xml:space="preserve"> quanto ao resultado prometido. Se a cobertura efetiva não corresponder ao que ela mesma se comprometeu, ou se o horário de atendimento ficar descoberto, aplica-se o regime de não conformidade da Cláusula 3.4.</w:t>
-      </w:r>
-    </w:p>
-    <w:p>
-      <w:r>
-        <w:rPr>
-          <w:b/>
-        </w:rPr>
-        <w:t>2.6.3.</w:t>
-      </w:r>
-      <w:r>
-        <w:rPr>
-          <w:b w:val="0"/>
-        </w:rPr>
-        <w:t xml:space="preserve"> Serviços fora do escopo ordinário serão solicitados por </w:t>
-      </w:r>
-      <w:r>
-        <w:rPr>
-          <w:b/>
-        </w:rPr>
-        <w:t>Ordem de Serviço escrita</w:t>
-      </w:r>
-      <w:r>
-        <w:rPr>
-          <w:b w:val="0"/>
-        </w:rPr>
-        <w:t>, dirigida ao Preposto, com prazo e, se houver custo adicional, com orçamento previamente aceito.</w:t>
+        <w:t>: preços e tarifas, política de reservas e cancelamento, cortesias e descontos, escolha e contratação de fornecedores, investimentos e obras, e a representação do empreendimento perante terceiros.</w:t>
       </w:r>
     </w:p>
     <w:p>
@@ -565,7 +363,7 @@
           <w:color w:val="C9A84C"/>
           <w:sz w:val="25"/>
         </w:rPr>
-        <w:t>3. COMO A OPERAÇÃO É COORDENADA NO DIA A DIA</w:t>
+        <w:t>2. HORÁRIO DE ATENDIMENTO DO EMPREENDIMENTO</w:t>
       </w:r>
     </w:p>
     <w:p>
@@ -573,25 +371,37 @@
         <w:rPr>
           <w:b/>
         </w:rPr>
-        <w:t>3.1.</w:t>
+        <w:t>2.1.</w:t>
       </w:r>
       <w:r>
         <w:rPr>
           <w:b w:val="0"/>
         </w:rPr>
-        <w:t xml:space="preserve"> A CONTRATADA indicará um </w:t>
+        <w:t xml:space="preserve"> O empreendimento recebe hóspedes </w:t>
       </w:r>
       <w:r>
         <w:rPr>
           <w:b/>
         </w:rPr>
-        <w:t>Preposto</w:t>
+        <w:t>das 7h30 às 19h00, todos os dias</w:t>
       </w:r>
       <w:r>
         <w:rPr>
           <w:b w:val="0"/>
         </w:rPr>
-        <w:t xml:space="preserve"> — pessoa responsável por receber as comunicações da CONTRATANTE, distribuir as tarefas na equipe e responder pela execução.</w:t>
+        <w:t xml:space="preserve">. A CONTRATADA se compromete a </w:t>
+      </w:r>
+      <w:r>
+        <w:rPr>
+          <w:b/>
+        </w:rPr>
+        <w:t>manter esse período coberto</w:t>
+      </w:r>
+      <w:r>
+        <w:rPr>
+          <w:b w:val="0"/>
+        </w:rPr>
+        <w:t>, com ao menos uma pessoa qualificada e apta a atender, reforçando a equipe quando a ocupação exigir.</w:t>
       </w:r>
     </w:p>
     <w:p>
@@ -599,37 +409,25 @@
         <w:rPr>
           <w:b/>
         </w:rPr>
-        <w:t>3.2.</w:t>
+        <w:t>2.2.</w:t>
       </w:r>
       <w:r>
         <w:rPr>
           <w:b w:val="0"/>
         </w:rPr>
-        <w:t xml:space="preserve"> Todo dia a CONTRATANTE passará ao Preposto a </w:t>
+        <w:t xml:space="preserve"> Esse período é o </w:t>
       </w:r>
       <w:r>
         <w:rPr>
           <w:b/>
         </w:rPr>
-        <w:t>programação do dia</w:t>
+        <w:t>horário de funcionamento do empreendimento</w:t>
       </w:r>
       <w:r>
         <w:rPr>
           <w:b w:val="0"/>
         </w:rPr>
-        <w:t xml:space="preserve">: chegadas e saídas previstas com horários, unidades envolvidas, pedidos e restrições de hóspedes, eventos, bloqueios e prioridades. Essa programação diz </w:t>
-      </w:r>
-      <w:r>
-        <w:rPr>
-          <w:b/>
-        </w:rPr>
-        <w:t>o que precisa ser entregue e quando o hóspede espera</w:t>
-      </w:r>
-      <w:r>
-        <w:rPr>
-          <w:b w:val="0"/>
-        </w:rPr>
-        <w:t xml:space="preserve"> — a definição de quem faz, em que ordem e de que modo é do Preposto.</w:t>
+        <w:t xml:space="preserve"> e define o resultado esperado do serviço — não é jornada, escala ou expediente de ninguém.</w:t>
       </w:r>
     </w:p>
     <w:p>
@@ -637,25 +435,25 @@
         <w:rPr>
           <w:b/>
         </w:rPr>
-        <w:t>3.3.</w:t>
+        <w:t>2.3.</w:t>
       </w:r>
       <w:r>
         <w:rPr>
           <w:b w:val="0"/>
         </w:rPr>
-        <w:t xml:space="preserve"> A comunicação será feita por </w:t>
+        <w:t xml:space="preserve"> Cabe </w:t>
       </w:r>
       <w:r>
         <w:rPr>
           <w:b/>
         </w:rPr>
-        <w:t>um único canal escrito</w:t>
+        <w:t>à CONTRATADA</w:t>
       </w:r>
       <w:r>
         <w:rPr>
           <w:b w:val="0"/>
         </w:rPr>
-        <w:t>, entre a CONTRATANTE e o Preposto.</w:t>
+        <w:t xml:space="preserve"> organizar como cobre esse período: quem trabalha em cada momento, o revezamento da equipe, os intervalos, os descansos, as folgas, o tamanho do time e as substituições. Essas decisões são dela, e podem mudar quando ela quiser.</w:t>
       </w:r>
     </w:p>
     <w:p>
@@ -663,25 +461,179 @@
         <w:rPr>
           <w:b/>
         </w:rPr>
-        <w:t>3.4.</w:t>
+        <w:t>2.4.</w:t>
       </w:r>
       <w:r>
         <w:rPr>
           <w:b w:val="0"/>
         </w:rPr>
-        <w:t xml:space="preserve"> Se algo não sair no padrão, a CONTRATANTE apontará por escrito ao Preposto, e a CONTRATADA terá </w:t>
+        <w:t xml:space="preserve"> </w:t>
       </w:r>
       <w:r>
         <w:rPr>
           <w:b/>
         </w:rPr>
-        <w:t>24 (vinte e quatro) horas</w:t>
+        <w:t>Não há, para a CONTRATADA ou para qualquer pessoa de sua equipe, dia ou horário fixo de início e término.</w:t>
       </w:r>
       <w:r>
         <w:rPr>
           <w:b w:val="0"/>
         </w:rPr>
-        <w:t xml:space="preserve"> para corrigir, sem custo adicional.</w:t>
+        <w:t xml:space="preserve"> A CONTRATANTE não exige a presença pessoal da titular, não escolhe quem cobre cada período, não marca horário de entrada ou de saída de ninguém, não controla tempo de permanência e não registra frequência. A obrigação assumida é da </w:t>
+      </w:r>
+      <w:r>
+        <w:rPr>
+          <w:b/>
+        </w:rPr>
+        <w:t>empresa</w:t>
+      </w:r>
+      <w:r>
+        <w:rPr>
+          <w:b w:val="0"/>
+        </w:rPr>
+        <w:t>, e consiste em manter o atendimento coberto.</w:t>
+      </w:r>
+    </w:p>
+    <w:p>
+      <w:r>
+        <w:rPr>
+          <w:b/>
+        </w:rPr>
+        <w:t>2.5.</w:t>
+      </w:r>
+      <w:r>
+        <w:rPr>
+          <w:b w:val="0"/>
+        </w:rPr>
+        <w:t xml:space="preserve"> Fora desse período, eventuais chegadas tardias ou intercorrências serão atendidas conforme disponibilidade organizada pela própria CONTRATADA, já compreendida no preço.</w:t>
+      </w:r>
+    </w:p>
+    <w:p>
+      <w:r>
+        <w:rPr>
+          <w:b/>
+        </w:rPr>
+        <w:t>2.6. Plano de Cobertura.</w:t>
+      </w:r>
+      <w:r>
+        <w:rPr>
+          <w:b w:val="0"/>
+        </w:rPr>
+        <w:t xml:space="preserve"> Para dar previsibilidade à operação, a CONTRATADA apresentará à CONTRATANTE, na assinatura deste contrato e sempre que houver alteração, um </w:t>
+      </w:r>
+      <w:r>
+        <w:rPr>
+          <w:b/>
+        </w:rPr>
+        <w:t>Plano de Cobertura</w:t>
+      </w:r>
+      <w:r>
+        <w:rPr>
+          <w:b w:val="0"/>
+        </w:rPr>
+        <w:t xml:space="preserve"> por escrito, indicando </w:t>
+      </w:r>
+      <w:r>
+        <w:rPr>
+          <w:b/>
+        </w:rPr>
+        <w:t>como pretende cobrir o horário de atendimento</w:t>
+      </w:r>
+      <w:r>
+        <w:rPr>
+          <w:b w:val="0"/>
+        </w:rPr>
+        <w:t>: os períodos, as pessoas designadas para cada um, o revezamento previsto e quem responde em cada momento.</w:t>
+      </w:r>
+    </w:p>
+    <w:p>
+      <w:r>
+        <w:rPr>
+          <w:b/>
+        </w:rPr>
+        <w:t>2.6.1.</w:t>
+      </w:r>
+      <w:r>
+        <w:rPr>
+          <w:b w:val="0"/>
+        </w:rPr>
+        <w:t xml:space="preserve"> O Plano é </w:t>
+      </w:r>
+      <w:r>
+        <w:rPr>
+          <w:b/>
+        </w:rPr>
+        <w:t>elaborado pela CONTRATADA</w:t>
+      </w:r>
+      <w:r>
+        <w:rPr>
+          <w:b w:val="0"/>
+        </w:rPr>
+        <w:t xml:space="preserve">, que pode alterá-lo sempre que entender necessário, bastando comunicar a CONTRATANTE. A CONTRATANTE </w:t>
+      </w:r>
+      <w:r>
+        <w:rPr>
+          <w:b/>
+        </w:rPr>
+        <w:t>não aprova, não altera e não define</w:t>
+      </w:r>
+      <w:r>
+        <w:rPr>
+          <w:b w:val="0"/>
+        </w:rPr>
+        <w:t xml:space="preserve"> o conteúdo do Plano: apenas confere se ele atende à cobertura contratada na Cláusula 2.1 e registra o recebimento.</w:t>
+      </w:r>
+    </w:p>
+    <w:p>
+      <w:r>
+        <w:rPr>
+          <w:b/>
+        </w:rPr>
+        <w:t>2.6.2.</w:t>
+      </w:r>
+      <w:r>
+        <w:rPr>
+          <w:b w:val="0"/>
+        </w:rPr>
+        <w:t xml:space="preserve"> O Plano vale como </w:t>
+      </w:r>
+      <w:r>
+        <w:rPr>
+          <w:b/>
+        </w:rPr>
+        <w:t>compromisso da empresa CONTRATADA</w:t>
+      </w:r>
+      <w:r>
+        <w:rPr>
+          <w:b w:val="0"/>
+        </w:rPr>
+        <w:t xml:space="preserve"> quanto ao resultado prometido. Se a cobertura efetiva não corresponder ao que ela mesma se comprometeu, ou se o horário de atendimento ficar descoberto, aplica-se o regime de não conformidade da Cláusula 3.4.</w:t>
+      </w:r>
+    </w:p>
+    <w:p>
+      <w:r>
+        <w:rPr>
+          <w:b/>
+        </w:rPr>
+        <w:t>2.6.3.</w:t>
+      </w:r>
+      <w:r>
+        <w:rPr>
+          <w:b w:val="0"/>
+        </w:rPr>
+        <w:t xml:space="preserve"> Serviços fora do escopo ordinário serão solicitados por </w:t>
+      </w:r>
+      <w:r>
+        <w:rPr>
+          <w:b/>
+        </w:rPr>
+        <w:t>Ordem de Serviço escrita</w:t>
+      </w:r>
+      <w:r>
+        <w:rPr>
+          <w:b w:val="0"/>
+        </w:rPr>
+        <w:t>, dirigida ao Preposto, com prazo e, se houver custo adicional, com orçamento previamente aceito.</w:t>
       </w:r>
     </w:p>
     <w:p>
@@ -703,7 +655,7 @@
           <w:color w:val="C9A84C"/>
           <w:sz w:val="25"/>
         </w:rPr>
-        <w:t>4. AUTONOMIA E AUSÊNCIA DE VÍNCULO</w:t>
+        <w:t>3. COMO A OPERAÇÃO É COORDENADA NO DIA A DIA</w:t>
       </w:r>
     </w:p>
     <w:p>
@@ -711,25 +663,25 @@
         <w:rPr>
           <w:b/>
         </w:rPr>
-        <w:t>4.1.</w:t>
+        <w:t>3.1.</w:t>
       </w:r>
       <w:r>
         <w:rPr>
           <w:b w:val="0"/>
         </w:rPr>
-        <w:t xml:space="preserve"> Este é um contrato </w:t>
+        <w:t xml:space="preserve"> A CONTRATADA indicará um </w:t>
       </w:r>
       <w:r>
         <w:rPr>
           <w:b/>
         </w:rPr>
-        <w:t>civil, entre duas empresas</w:t>
+        <w:t>Preposto</w:t>
       </w:r>
       <w:r>
         <w:rPr>
           <w:b w:val="0"/>
         </w:rPr>
-        <w:t>. Não há vínculo empregatício entre as Partes, nem entre a CONTRATANTE e as pessoas que trabalham para a CONTRATADA.</w:t>
+        <w:t xml:space="preserve"> — pessoa responsável por receber as comunicações da CONTRATANTE, distribuir as tarefas na equipe e responder pela execução.</w:t>
       </w:r>
     </w:p>
     <w:p>
@@ -737,13 +689,37 @@
         <w:rPr>
           <w:b/>
         </w:rPr>
-        <w:t>4.2.</w:t>
+        <w:t>3.2.</w:t>
       </w:r>
       <w:r>
         <w:rPr>
           <w:b w:val="0"/>
         </w:rPr>
-        <w:t xml:space="preserve"> As Partes reconhecem que não estão presentes os requisitos dos artigos 2º e 3º da CLT: a CONTRATADA organiza seu trabalho com autonomia, pode se fazer substituir quando quiser, é livre para atender outros clientes e assume os riscos e os custos da própria atividade.</w:t>
+        <w:t xml:space="preserve"> Todo dia a CONTRATANTE passará ao Preposto a </w:t>
+      </w:r>
+      <w:r>
+        <w:rPr>
+          <w:b/>
+        </w:rPr>
+        <w:t>programação do dia</w:t>
+      </w:r>
+      <w:r>
+        <w:rPr>
+          <w:b w:val="0"/>
+        </w:rPr>
+        <w:t xml:space="preserve">: chegadas e saídas previstas com horários, unidades envolvidas, pedidos e restrições de hóspedes, eventos, bloqueios e prioridades. Essa programação diz </w:t>
+      </w:r>
+      <w:r>
+        <w:rPr>
+          <w:b/>
+        </w:rPr>
+        <w:t>o que precisa ser entregue e quando o hóspede espera</w:t>
+      </w:r>
+      <w:r>
+        <w:rPr>
+          <w:b w:val="0"/>
+        </w:rPr>
+        <w:t xml:space="preserve"> — a definição de quem faz, em que ordem e de que modo é do Preposto.</w:t>
       </w:r>
     </w:p>
     <w:p>
@@ -751,191 +727,51 @@
         <w:rPr>
           <w:b/>
         </w:rPr>
-        <w:t>4.3.</w:t>
+        <w:t>3.3.</w:t>
       </w:r>
       <w:r>
         <w:rPr>
           <w:b w:val="0"/>
         </w:rPr>
-        <w:t xml:space="preserve"> Para preservar essa autonomia, as Partes combinam a seguinte forma de trabalho:</w:t>
+        <w:t xml:space="preserve"> A comunicação será feita por </w:t>
+      </w:r>
+      <w:r>
+        <w:rPr>
+          <w:b/>
+        </w:rPr>
+        <w:t>um único canal escrito</w:t>
+      </w:r>
+      <w:r>
+        <w:rPr>
+          <w:b w:val="0"/>
+        </w:rPr>
+        <w:t>, entre a CONTRATANTE e o Preposto.</w:t>
       </w:r>
     </w:p>
     <w:p>
       <w:r>
         <w:rPr>
+          <w:b/>
+        </w:rPr>
+        <w:t>3.4.</w:t>
+      </w:r>
+      <w:r>
+        <w:rPr>
           <w:b w:val="0"/>
         </w:rPr>
-        <w:t xml:space="preserve">a) </w:t>
+        <w:t xml:space="preserve"> Se algo não sair no padrão, a CONTRATANTE apontará por escrito ao Preposto, e a CONTRATADA terá </w:t>
       </w:r>
       <w:r>
         <w:rPr>
           <w:b/>
         </w:rPr>
-        <w:t>Coordenação do serviço.</w:t>
+        <w:t>24 (vinte e quatro) horas</w:t>
       </w:r>
       <w:r>
         <w:rPr>
           <w:b w:val="0"/>
         </w:rPr>
-        <w:t xml:space="preserve"> A programação do dia, as informações sobre hóspedes e os pedidos pontuais que surgirem podem ser transmitidos a qualquer pessoa da equipe que esteja no local. Trata-se de </w:t>
-      </w:r>
-      <w:r>
-        <w:rPr>
-          <w:b/>
-        </w:rPr>
-        <w:t>informação da demanda</w:t>
-      </w:r>
-      <w:r>
-        <w:rPr>
-          <w:b w:val="0"/>
-        </w:rPr>
-        <w:t xml:space="preserve"> — o que o hóspede precisa e quando —, necessária ao funcionamento do empreendimento.</w:t>
-      </w:r>
-    </w:p>
-    <w:p>
-      <w:r>
-        <w:rPr>
-          <w:b w:val="0"/>
-        </w:rPr>
-        <w:t xml:space="preserve">b) </w:t>
-      </w:r>
-      <w:r>
-        <w:rPr>
-          <w:b/>
-        </w:rPr>
-        <w:t>Direção do trabalho.</w:t>
-      </w:r>
-      <w:r>
-        <w:rPr>
-          <w:b w:val="0"/>
-        </w:rPr>
-        <w:t xml:space="preserve"> A distribuição das tarefas entre as pessoas, a definição de quem faz o quê, as correções, as cobranças e os ajustes de conduta são feitos </w:t>
-      </w:r>
-      <w:r>
-        <w:rPr>
-          <w:b/>
-        </w:rPr>
-        <w:t>pelo Preposto</w:t>
-      </w:r>
-      <w:r>
-        <w:rPr>
-          <w:b w:val="0"/>
-        </w:rPr>
-        <w:t>, e é a ele que a CONTRATANTE se dirige nesses casos.</w:t>
-      </w:r>
-    </w:p>
-    <w:p>
-      <w:r>
-        <w:rPr>
-          <w:b w:val="0"/>
-        </w:rPr>
-        <w:t xml:space="preserve">c) </w:t>
-      </w:r>
-      <w:r>
-        <w:rPr>
-          <w:b/>
-        </w:rPr>
-        <w:t>Horários.</w:t>
-      </w:r>
-      <w:r>
-        <w:rPr>
-          <w:b w:val="0"/>
-        </w:rPr>
-        <w:t xml:space="preserve"> A CONTRATANTE informa os horários </w:t>
-      </w:r>
-      <w:r>
-        <w:rPr>
-          <w:b/>
-        </w:rPr>
-        <w:t>do hóspede e da operação</w:t>
-      </w:r>
-      <w:r>
-        <w:rPr>
-          <w:b w:val="0"/>
-        </w:rPr>
-        <w:t xml:space="preserve"> — chegadas, saídas, refeições, eventos. Não fixa horário pessoal de entrada, saída ou intervalo de nenhuma pessoa da equipe, nem exige a presença da titular da CONTRATADA.</w:t>
-      </w:r>
-    </w:p>
-    <w:p>
-      <w:r>
-        <w:rPr>
-          <w:b w:val="0"/>
-        </w:rPr>
-        <w:t xml:space="preserve">d) </w:t>
-      </w:r>
-      <w:r>
-        <w:rPr>
-          <w:b/>
-        </w:rPr>
-        <w:t>Pagamentos.</w:t>
-      </w:r>
-      <w:r>
-        <w:rPr>
-          <w:b w:val="0"/>
-        </w:rPr>
-        <w:t xml:space="preserve"> A única contraprestação pelos serviços é o preço da Cláusula 6.1, pago </w:t>
-      </w:r>
-      <w:r>
-        <w:rPr>
-          <w:b/>
-        </w:rPr>
-        <w:t>à empresa</w:t>
-      </w:r>
-      <w:r>
-        <w:rPr>
-          <w:b w:val="0"/>
-        </w:rPr>
-        <w:t xml:space="preserve"> CONTRATADA contra nota fiscal. Valores adicionais eventualmente combinados — serviço extraordinário, reembolso de despesa ou antecipação do próprio preço — também são pagos à empresa e documentados. A CONTRATANTE não faz pagamentos, empréstimos nem concede benefícios individuais a pessoas da equipe.</w:t>
-      </w:r>
-    </w:p>
-    <w:p>
-      <w:r>
-        <w:rPr>
-          <w:b/>
-        </w:rPr>
-        <w:t>4.4.</w:t>
-      </w:r>
-      <w:r>
-        <w:rPr>
-          <w:b w:val="0"/>
-        </w:rPr>
-        <w:t xml:space="preserve"> A CONTRATADA regularizará, em até </w:t>
-      </w:r>
-      <w:r>
-        <w:rPr>
-          <w:b/>
-        </w:rPr>
-        <w:t>30 (trinta) dias</w:t>
-      </w:r>
-      <w:r>
-        <w:rPr>
-          <w:b w:val="0"/>
-        </w:rPr>
-        <w:t xml:space="preserve"> contados da assinatura, o cadastro do seu CNPJ, com </w:t>
-      </w:r>
-      <w:r>
-        <w:rPr>
-          <w:b/>
-        </w:rPr>
-        <w:t>sede em endereço próprio e distinto do empreendimento</w:t>
-      </w:r>
-      <w:r>
-        <w:rPr>
-          <w:b w:val="0"/>
-        </w:rPr>
-        <w:t xml:space="preserve"> e atividade principal compatível com o objeto (CNAE 81.21-4-00 ou 81.29-0-00), e manterá </w:t>
-      </w:r>
-      <w:r>
-        <w:rPr>
-          <w:b/>
-        </w:rPr>
-        <w:t>conta bancária e chave PIX em nome da empresa</w:t>
-      </w:r>
-      <w:r>
-        <w:rPr>
-          <w:b w:val="0"/>
-        </w:rPr>
-        <w:t>, para recebimento na forma da Cláusula 6.3. Enquanto pendente a regularização, a CONTRATANTE poderá reter os pagamentos, sem que isso configure atraso.</w:t>
+        <w:t xml:space="preserve"> para corrigir, sem custo adicional.</w:t>
       </w:r>
     </w:p>
     <w:p>
@@ -957,7 +793,7 @@
           <w:color w:val="C9A84C"/>
           <w:sz w:val="25"/>
         </w:rPr>
-        <w:t>5. A EQUIPE DA CONTRATADA</w:t>
+        <w:t>4. AUTONOMIA E AUSÊNCIA DE VÍNCULO</w:t>
       </w:r>
     </w:p>
     <w:p>
@@ -965,25 +801,25 @@
         <w:rPr>
           <w:b/>
         </w:rPr>
-        <w:t>5.1.</w:t>
+        <w:t>4.1.</w:t>
       </w:r>
       <w:r>
         <w:rPr>
           <w:b w:val="0"/>
         </w:rPr>
-        <w:t xml:space="preserve"> A CONTRATADA é a </w:t>
+        <w:t xml:space="preserve"> Este é um contrato </w:t>
       </w:r>
       <w:r>
         <w:rPr>
           <w:b/>
         </w:rPr>
-        <w:t>empregadora</w:t>
+        <w:t>civil, entre duas empresas</w:t>
       </w:r>
       <w:r>
         <w:rPr>
           <w:b w:val="0"/>
         </w:rPr>
-        <w:t xml:space="preserve"> de todas as pessoas que utilizar, contratando, pagando, orientando e desligando por sua conta.</w:t>
+        <w:t>. Não há vínculo empregatício entre as Partes, nem entre a CONTRATANTE e as pessoas que trabalham para a CONTRATADA.</w:t>
       </w:r>
     </w:p>
     <w:p>
@@ -991,25 +827,13 @@
         <w:rPr>
           <w:b/>
         </w:rPr>
-        <w:t>5.2.</w:t>
+        <w:t>4.2.</w:t>
       </w:r>
       <w:r>
         <w:rPr>
           <w:b w:val="0"/>
         </w:rPr>
-        <w:t xml:space="preserve"> Toda pessoa que trabalhe no empreendimento por conta da CONTRATADA — </w:t>
-      </w:r>
-      <w:r>
-        <w:rPr>
-          <w:b/>
-        </w:rPr>
-        <w:t>inclusive cônjuge ou familiar</w:t>
-      </w:r>
-      <w:r>
-        <w:rPr>
-          <w:b w:val="0"/>
-        </w:rPr>
-        <w:t xml:space="preserve"> — deve estar formalizada como titular, sócio, empregado com CTPS assinada ou prestador com CNPJ próprio, com os encargos em dia.</w:t>
+        <w:t xml:space="preserve"> As Partes reconhecem que não estão presentes os requisitos dos artigos 2º e 3º da CLT: a CONTRATADA organiza seu trabalho com autonomia, pode se fazer substituir quando quiser, é livre para atender outros clientes e assume os riscos e os custos da própria atividade.</w:t>
       </w:r>
     </w:p>
     <w:p>
@@ -1017,13 +841,191 @@
         <w:rPr>
           <w:b/>
         </w:rPr>
-        <w:t>5.3.</w:t>
+        <w:t>4.3.</w:t>
       </w:r>
       <w:r>
         <w:rPr>
           <w:b w:val="0"/>
         </w:rPr>
-        <w:t xml:space="preserve"> A cada mês, no recibo, a CONTRATADA informará quem trabalhou no período e sob qual vínculo.</w:t>
+        <w:t xml:space="preserve"> Para preservar essa autonomia, as Partes combinam a seguinte forma de trabalho:</w:t>
+      </w:r>
+    </w:p>
+    <w:p>
+      <w:r>
+        <w:rPr>
+          <w:b w:val="0"/>
+        </w:rPr>
+        <w:t xml:space="preserve">a) </w:t>
+      </w:r>
+      <w:r>
+        <w:rPr>
+          <w:b/>
+        </w:rPr>
+        <w:t>Coordenação do serviço.</w:t>
+      </w:r>
+      <w:r>
+        <w:rPr>
+          <w:b w:val="0"/>
+        </w:rPr>
+        <w:t xml:space="preserve"> A programação do dia, as informações sobre hóspedes e os pedidos pontuais que surgirem podem ser transmitidos a qualquer pessoa da equipe que esteja no local. Trata-se de </w:t>
+      </w:r>
+      <w:r>
+        <w:rPr>
+          <w:b/>
+        </w:rPr>
+        <w:t>informação da demanda</w:t>
+      </w:r>
+      <w:r>
+        <w:rPr>
+          <w:b w:val="0"/>
+        </w:rPr>
+        <w:t xml:space="preserve"> — o que o hóspede precisa e quando —, necessária ao funcionamento do empreendimento.</w:t>
+      </w:r>
+    </w:p>
+    <w:p>
+      <w:r>
+        <w:rPr>
+          <w:b w:val="0"/>
+        </w:rPr>
+        <w:t xml:space="preserve">b) </w:t>
+      </w:r>
+      <w:r>
+        <w:rPr>
+          <w:b/>
+        </w:rPr>
+        <w:t>Direção do trabalho.</w:t>
+      </w:r>
+      <w:r>
+        <w:rPr>
+          <w:b w:val="0"/>
+        </w:rPr>
+        <w:t xml:space="preserve"> A distribuição das tarefas entre as pessoas, a definição de quem faz o quê, as correções, as cobranças e os ajustes de conduta são feitos </w:t>
+      </w:r>
+      <w:r>
+        <w:rPr>
+          <w:b/>
+        </w:rPr>
+        <w:t>pelo Preposto</w:t>
+      </w:r>
+      <w:r>
+        <w:rPr>
+          <w:b w:val="0"/>
+        </w:rPr>
+        <w:t>, e é a ele que a CONTRATANTE se dirige nesses casos.</w:t>
+      </w:r>
+    </w:p>
+    <w:p>
+      <w:r>
+        <w:rPr>
+          <w:b w:val="0"/>
+        </w:rPr>
+        <w:t xml:space="preserve">c) </w:t>
+      </w:r>
+      <w:r>
+        <w:rPr>
+          <w:b/>
+        </w:rPr>
+        <w:t>Horários.</w:t>
+      </w:r>
+      <w:r>
+        <w:rPr>
+          <w:b w:val="0"/>
+        </w:rPr>
+        <w:t xml:space="preserve"> A CONTRATANTE informa os horários </w:t>
+      </w:r>
+      <w:r>
+        <w:rPr>
+          <w:b/>
+        </w:rPr>
+        <w:t>do hóspede e da operação</w:t>
+      </w:r>
+      <w:r>
+        <w:rPr>
+          <w:b w:val="0"/>
+        </w:rPr>
+        <w:t xml:space="preserve"> — chegadas, saídas, refeições, eventos. Não fixa horário pessoal de entrada, saída ou intervalo de nenhuma pessoa da equipe, nem exige a presença da titular da CONTRATADA.</w:t>
+      </w:r>
+    </w:p>
+    <w:p>
+      <w:r>
+        <w:rPr>
+          <w:b w:val="0"/>
+        </w:rPr>
+        <w:t xml:space="preserve">d) </w:t>
+      </w:r>
+      <w:r>
+        <w:rPr>
+          <w:b/>
+        </w:rPr>
+        <w:t>Pagamentos.</w:t>
+      </w:r>
+      <w:r>
+        <w:rPr>
+          <w:b w:val="0"/>
+        </w:rPr>
+        <w:t xml:space="preserve"> A única contraprestação pelos serviços é o preço da Cláusula 6.1, pago </w:t>
+      </w:r>
+      <w:r>
+        <w:rPr>
+          <w:b/>
+        </w:rPr>
+        <w:t>à empresa</w:t>
+      </w:r>
+      <w:r>
+        <w:rPr>
+          <w:b w:val="0"/>
+        </w:rPr>
+        <w:t xml:space="preserve"> CONTRATADA contra nota fiscal. Valores adicionais eventualmente combinados — serviço extraordinário, reembolso de despesa ou antecipação do próprio preço — também são pagos à empresa e documentados. A CONTRATANTE não faz pagamentos, empréstimos nem concede benefícios individuais a pessoas da equipe.</w:t>
+      </w:r>
+    </w:p>
+    <w:p>
+      <w:r>
+        <w:rPr>
+          <w:b/>
+        </w:rPr>
+        <w:t>4.4.</w:t>
+      </w:r>
+      <w:r>
+        <w:rPr>
+          <w:b w:val="0"/>
+        </w:rPr>
+        <w:t xml:space="preserve"> A CONTRATADA regularizará, em até </w:t>
+      </w:r>
+      <w:r>
+        <w:rPr>
+          <w:b/>
+        </w:rPr>
+        <w:t>30 (trinta) dias</w:t>
+      </w:r>
+      <w:r>
+        <w:rPr>
+          <w:b w:val="0"/>
+        </w:rPr>
+        <w:t xml:space="preserve"> contados da assinatura, o cadastro do seu CNPJ, com </w:t>
+      </w:r>
+      <w:r>
+        <w:rPr>
+          <w:b/>
+        </w:rPr>
+        <w:t>sede em endereço próprio e distinto do empreendimento</w:t>
+      </w:r>
+      <w:r>
+        <w:rPr>
+          <w:b w:val="0"/>
+        </w:rPr>
+        <w:t xml:space="preserve"> e atividade principal compatível com o objeto (CNAE 81.21-4-00 ou 81.29-0-00), e manterá </w:t>
+      </w:r>
+      <w:r>
+        <w:rPr>
+          <w:b/>
+        </w:rPr>
+        <w:t>conta bancária e chave PIX em nome da empresa</w:t>
+      </w:r>
+      <w:r>
+        <w:rPr>
+          <w:b w:val="0"/>
+        </w:rPr>
+        <w:t>, para recebimento na forma da Cláusula 6.3. Enquanto pendente a regularização, a CONTRATANTE poderá reter os pagamentos, sem que isso configure atraso.</w:t>
       </w:r>
     </w:p>
     <w:p>
@@ -1045,7 +1047,7 @@
           <w:color w:val="C9A84C"/>
           <w:sz w:val="25"/>
         </w:rPr>
-        <w:t>6. PREÇO E PAGAMENTO</w:t>
+        <w:t>5. A EQUIPE DA CONTRATADA</w:t>
       </w:r>
     </w:p>
     <w:p>
@@ -1053,25 +1055,25 @@
         <w:rPr>
           <w:b/>
         </w:rPr>
-        <w:t>6.1.</w:t>
+        <w:t>5.1.</w:t>
       </w:r>
       <w:r>
         <w:rPr>
           <w:b w:val="0"/>
         </w:rPr>
-        <w:t xml:space="preserve"> O preço vigente é de </w:t>
+        <w:t xml:space="preserve"> A CONTRATADA é a </w:t>
       </w:r>
       <w:r>
         <w:rPr>
           <w:b/>
         </w:rPr>
-        <w:t>R$ 5.000,00 (cinco mil reais) por mês</w:t>
+        <w:t>empregadora</w:t>
       </w:r>
       <w:r>
         <w:rPr>
           <w:b w:val="0"/>
         </w:rPr>
-        <w:t>, valor global que compreende mão de obra, encargos, insumos, deslocamentos, tributos e a margem da CONTRATADA.</w:t>
+        <w:t xml:space="preserve"> de todas as pessoas que utilizar, contratando, pagando, orientando e desligando por sua conta.</w:t>
       </w:r>
     </w:p>
     <w:p>
@@ -1079,25 +1081,25 @@
         <w:rPr>
           <w:b/>
         </w:rPr>
-        <w:t>6.1.1.</w:t>
+        <w:t>5.2.</w:t>
       </w:r>
       <w:r>
         <w:rPr>
           <w:b w:val="0"/>
         </w:rPr>
-        <w:t xml:space="preserve"> O preço pode ser </w:t>
+        <w:t xml:space="preserve"> Toda pessoa que trabalhe no empreendimento por conta da CONTRATADA — </w:t>
       </w:r>
       <w:r>
         <w:rPr>
           <w:b/>
         </w:rPr>
-        <w:t>revisto a qualquer tempo, de comum acordo</w:t>
+        <w:t>inclusive cônjuge ou familiar</w:t>
       </w:r>
       <w:r>
         <w:rPr>
           <w:b w:val="0"/>
         </w:rPr>
-        <w:t>, bastando o registro escrito da nova condição pelas duas Partes — inclusive por e-mail —, passando a valer a partir do mês seguinte. Enquanto não houver revisão, permanece o valor vigente.</w:t>
+        <w:t xml:space="preserve"> — deve estar formalizada como titular, sócio, empregado com CTPS assinada ou prestador com CNPJ próprio, com os encargos em dia.</w:t>
       </w:r>
     </w:p>
     <w:p>
@@ -1105,229 +1107,13 @@
         <w:rPr>
           <w:b/>
         </w:rPr>
-        <w:t>6.2.</w:t>
+        <w:t>5.3.</w:t>
       </w:r>
       <w:r>
         <w:rPr>
           <w:b w:val="0"/>
         </w:rPr>
-        <w:t xml:space="preserve"> Até o </w:t>
-      </w:r>
-      <w:r>
-        <w:rPr>
-          <w:b/>
-        </w:rPr>
-        <w:t>3º (terceiro) dia útil</w:t>
-      </w:r>
-      <w:r>
-        <w:rPr>
-          <w:b w:val="0"/>
-        </w:rPr>
-        <w:t xml:space="preserve"> de cada mês a CONTRATADA emitirá a </w:t>
-      </w:r>
-      <w:r>
-        <w:rPr>
-          <w:b/>
-        </w:rPr>
-        <w:t>nota fiscal</w:t>
-      </w:r>
-      <w:r>
-        <w:rPr>
-          <w:b w:val="0"/>
-        </w:rPr>
-        <w:t xml:space="preserve"> do mês anterior, acompanhada do </w:t>
-      </w:r>
-      <w:r>
-        <w:rPr>
-          <w:b/>
-        </w:rPr>
-        <w:t>Recibo Mensal</w:t>
-      </w:r>
-      <w:r>
-        <w:rPr>
-          <w:b w:val="0"/>
-        </w:rPr>
-        <w:t xml:space="preserve"> (anexo) e das certidões CND Federal, CRF/FGTS e CNDT. Havendo empregados, apresentará também folha de pagamento e guias de FGTS e INSS quitadas.</w:t>
-      </w:r>
-    </w:p>
-    <w:p>
-      <w:r>
-        <w:rPr>
-          <w:b/>
-        </w:rPr>
-        <w:t>6.3.</w:t>
-      </w:r>
-      <w:r>
-        <w:rPr>
-          <w:b w:val="0"/>
-        </w:rPr>
-        <w:t xml:space="preserve"> O pagamento será feito até o </w:t>
-      </w:r>
-      <w:r>
-        <w:rPr>
-          <w:b/>
-        </w:rPr>
-        <w:t>5º (quinto) dia útil</w:t>
-      </w:r>
-      <w:r>
-        <w:rPr>
-          <w:b w:val="0"/>
-        </w:rPr>
-        <w:t xml:space="preserve"> de cada mês, por transferência ou PIX para </w:t>
-      </w:r>
-      <w:r>
-        <w:rPr>
-          <w:b/>
-        </w:rPr>
-        <w:t>conta bancária de titularidade da empresa CONTRATADA, vinculada ao CNPJ 19.525.600/0001-00</w:t>
-      </w:r>
-      <w:r>
-        <w:rPr>
-          <w:b w:val="0"/>
-        </w:rPr>
-        <w:t>. Não haverá pagamento em espécie, em conta de pessoa física, nem parcelado em datas semanais ou quinzenais.</w:t>
-      </w:r>
-    </w:p>
-    <w:p>
-      <w:r>
-        <w:rPr>
-          <w:b/>
-        </w:rPr>
-        <w:t>6.3.1.</w:t>
-      </w:r>
-      <w:r>
-        <w:rPr>
-          <w:b w:val="0"/>
-        </w:rPr>
-        <w:t xml:space="preserve"> Cada pagamento será identificado com a </w:t>
-      </w:r>
-      <w:r>
-        <w:rPr>
-          <w:b/>
-        </w:rPr>
-        <w:t>competência a que se refere</w:t>
-      </w:r>
-      <w:r>
-        <w:rPr>
-          <w:b w:val="0"/>
-        </w:rPr>
-        <w:t xml:space="preserve">, e o comprovante de transferência será arquivado pelas duas Partes junto à nota fiscal e ao </w:t>
-      </w:r>
-      <w:r>
-        <w:rPr>
-          <w:b/>
-        </w:rPr>
-        <w:t>Recibo Mensal</w:t>
-      </w:r>
-      <w:r>
-        <w:rPr>
-          <w:b w:val="0"/>
-        </w:rPr>
-        <w:t xml:space="preserve"> do mesmo mês. Comprovante de pagamento isolado, sem nota fiscal e sem recibo, não substitui a documentação deste contrato.</w:t>
-      </w:r>
-    </w:p>
-    <w:p>
-      <w:r>
-        <w:rPr>
-          <w:b/>
-        </w:rPr>
-        <w:t>6.3.2.</w:t>
-      </w:r>
-      <w:r>
-        <w:rPr>
-          <w:b w:val="0"/>
-        </w:rPr>
-        <w:t xml:space="preserve"> A CONTRATADA entregará o </w:t>
-      </w:r>
-      <w:r>
-        <w:rPr>
-          <w:b/>
-        </w:rPr>
-        <w:t>Recibo Mensal assinado a cada mês</w:t>
-      </w:r>
-      <w:r>
-        <w:rPr>
-          <w:b w:val="0"/>
-        </w:rPr>
-        <w:t>, sem exceção, ainda que o pagamento tenha sido feito antes da entrega. O recibo é a peça que registra a autonomia da prestação e a quitação do período.</w:t>
-      </w:r>
-    </w:p>
-    <w:p>
-      <w:r>
-        <w:rPr>
-          <w:b/>
-        </w:rPr>
-        <w:t>6.4.</w:t>
-      </w:r>
-      <w:r>
-        <w:rPr>
-          <w:b w:val="0"/>
-        </w:rPr>
-        <w:t xml:space="preserve"> Faltando a nota fiscal, o recibo ou as certidões, o pagamento do mês seguinte aguarda a regularização, sem que isso configure atraso. Havendo atraso por parte da CONTRATANTE, incidem multa de 2%, juros de 1% ao mês e correção pelo IPCA.</w:t>
-      </w:r>
-    </w:p>
-    <w:p>
-      <w:r>
-        <w:rPr>
-          <w:b/>
-        </w:rPr>
-        <w:t>6.5.</w:t>
-      </w:r>
-      <w:r>
-        <w:rPr>
-          <w:b w:val="0"/>
-        </w:rPr>
-        <w:t xml:space="preserve"> A CONTRATANTE reterá </w:t>
-      </w:r>
-      <w:r>
-        <w:rPr>
-          <w:b/>
-        </w:rPr>
-        <w:t>5% (cinco por cento)</w:t>
-      </w:r>
-      <w:r>
-        <w:rPr>
-          <w:b w:val="0"/>
-        </w:rPr>
-        <w:t xml:space="preserve"> de cada pagamento, como garantia, devolvidos em parcela única </w:t>
-      </w:r>
-      <w:r>
-        <w:rPr>
-          <w:b/>
-        </w:rPr>
-        <w:t>90 (noventa) dias</w:t>
-      </w:r>
-      <w:r>
-        <w:rPr>
-          <w:b w:val="0"/>
-        </w:rPr>
-        <w:t xml:space="preserve"> após o fim do contrato, mediante CNDT atualizada e comprovação de quitação das verbas dos empregados que atuaram no empreendimento.</w:t>
-      </w:r>
-    </w:p>
-    <w:p>
-      <w:r>
-        <w:rPr>
-          <w:b/>
-        </w:rPr>
-        <w:t>6.6.</w:t>
-      </w:r>
-      <w:r>
-        <w:rPr>
-          <w:b w:val="0"/>
-        </w:rPr>
-        <w:t xml:space="preserve"> Não havendo revisão de comum acordo ao longo do período, o preço é reajustado uma vez por ano, pelo </w:t>
-      </w:r>
-      <w:r>
-        <w:rPr>
-          <w:b/>
-        </w:rPr>
-        <w:t>IPCA/IBGE</w:t>
-      </w:r>
-      <w:r>
-        <w:rPr>
-          <w:b w:val="0"/>
-        </w:rPr>
-        <w:t>, na data de aniversário do contrato.</w:t>
+        <w:t xml:space="preserve"> A cada mês, no recibo, a CONTRATADA informará quem trabalhou no período e sob qual vínculo.</w:t>
       </w:r>
     </w:p>
     <w:p>
@@ -1349,7 +1135,7 @@
           <w:color w:val="C9A84C"/>
           <w:sz w:val="25"/>
         </w:rPr>
-        <w:t>7. RESPONSABILIDADES DA CONTRATADA</w:t>
+        <w:t>6. PREÇO E PAGAMENTO</w:t>
       </w:r>
     </w:p>
     <w:p>
@@ -1357,13 +1143,25 @@
         <w:rPr>
           <w:b/>
         </w:rPr>
-        <w:t>7.1.</w:t>
+        <w:t>6.1.</w:t>
       </w:r>
       <w:r>
         <w:rPr>
           <w:b w:val="0"/>
         </w:rPr>
-        <w:t xml:space="preserve"> A CONTRATADA responde pelas obrigações trabalhistas, previdenciárias e fiscais de sua equipe, e pelos danos causados ao empreendimento, aos hóspedes ou a terceiros por si, sua equipe ou seus contratados.</w:t>
+        <w:t xml:space="preserve"> O preço vigente é de </w:t>
+      </w:r>
+      <w:r>
+        <w:rPr>
+          <w:b/>
+        </w:rPr>
+        <w:t>R$ 5.000,00 (cinco mil reais) por mês</w:t>
+      </w:r>
+      <w:r>
+        <w:rPr>
+          <w:b w:val="0"/>
+        </w:rPr>
+        <w:t>, valor global que compreende mão de obra, encargos, insumos, deslocamentos, tributos e a margem da CONTRATADA.</w:t>
       </w:r>
     </w:p>
     <w:p>
@@ -1371,37 +1169,25 @@
         <w:rPr>
           <w:b/>
         </w:rPr>
-        <w:t>7.2.</w:t>
+        <w:t>6.1.1.</w:t>
       </w:r>
       <w:r>
         <w:rPr>
           <w:b w:val="0"/>
         </w:rPr>
-        <w:t xml:space="preserve"> Se a CONTRATANTE for demandada ou autuada por fato decorrente deste contrato, inclusive por pessoa da equipe da CONTRATADA, esta </w:t>
+        <w:t xml:space="preserve"> O preço pode ser </w:t>
       </w:r>
       <w:r>
         <w:rPr>
           <w:b/>
         </w:rPr>
-        <w:t>ressarcirá os valores despendidos</w:t>
+        <w:t>revisto a qualquer tempo, de comum acordo</w:t>
       </w:r>
       <w:r>
         <w:rPr>
           <w:b w:val="0"/>
         </w:rPr>
-        <w:t xml:space="preserve"> — principal, encargos, custas e honorários — em até </w:t>
-      </w:r>
-      <w:r>
-        <w:rPr>
-          <w:b/>
-        </w:rPr>
-        <w:t>10 (dez) dias</w:t>
-      </w:r>
-      <w:r>
-        <w:rPr>
-          <w:b w:val="0"/>
-        </w:rPr>
-        <w:t xml:space="preserve"> da comprovação, e colaborará com a defesa fornecendo os documentos necessários. A CONTRATANTE poderá compensar esses valores com créditos da CONTRATADA, inclusive com a garantia da Cláusula 6.5. Esta obrigação permanece após o fim do contrato.</w:t>
+        <w:t>, bastando o registro escrito da nova condição pelas duas Partes — inclusive por e-mail —, passando a valer a partir do mês seguinte. Enquanto não houver revisão, permanece o valor vigente.</w:t>
       </w:r>
     </w:p>
     <w:p>
@@ -1409,45 +1195,87 @@
         <w:rPr>
           <w:b/>
         </w:rPr>
-        <w:t>7.3.</w:t>
+        <w:t>6.2.</w:t>
       </w:r>
       <w:r>
         <w:rPr>
           <w:b w:val="0"/>
         </w:rPr>
-        <w:t xml:space="preserve"> No serviço de alimentos e bebidas, a CONTRATADA seguirá a </w:t>
+        <w:t xml:space="preserve"> Até o </w:t>
       </w:r>
       <w:r>
         <w:rPr>
           <w:b/>
         </w:rPr>
-        <w:t>RDC ANVISA nº 216/2004</w:t>
+        <w:t>3º (terceiro) dia útil</w:t>
       </w:r>
       <w:r>
         <w:rPr>
           <w:b w:val="0"/>
         </w:rPr>
-        <w:t>, mantendo boas práticas, curso de manipulador e atestado de saúde da equipe em dia, controle de temperatura, guarda de amostras por 72 horas e informação de alergênicos. Não servirá bebida alcoólica a menor de 18 anos. Responde pelos danos à saúde decorrentes dos alimentos que preparar ou servir.</w:t>
+        <w:t xml:space="preserve"> de cada mês a CONTRATADA emitirá a </w:t>
+      </w:r>
+      <w:r>
+        <w:rPr>
+          <w:b/>
+        </w:rPr>
+        <w:t>nota fiscal</w:t>
+      </w:r>
+      <w:r>
+        <w:rPr>
+          <w:b w:val="0"/>
+        </w:rPr>
+        <w:t xml:space="preserve"> do mês anterior, acompanhada do </w:t>
+      </w:r>
+      <w:r>
+        <w:rPr>
+          <w:b/>
+        </w:rPr>
+        <w:t>Recibo Mensal</w:t>
+      </w:r>
+      <w:r>
+        <w:rPr>
+          <w:b w:val="0"/>
+        </w:rPr>
+        <w:t xml:space="preserve"> (anexo) e das certidões CND Federal, CRF/FGTS e CNDT. Havendo empregados, apresentará também folha de pagamento e guias de FGTS e INSS quitadas.</w:t>
       </w:r>
     </w:p>
     <w:p>
       <w:r>
         <w:rPr>
+          <w:b/>
+        </w:rPr>
+        <w:t>6.3.</w:t>
+      </w:r>
+      <w:r>
+        <w:rPr>
           <w:b w:val="0"/>
         </w:rPr>
-        <w:t xml:space="preserve">Os alimentos serão preparados na </w:t>
+        <w:t xml:space="preserve"> O pagamento será feito até o </w:t>
       </w:r>
       <w:r>
         <w:rPr>
           <w:b/>
         </w:rPr>
-        <w:t>copa da cozinha do empreendimento, ao lado da recepção</w:t>
+        <w:t>5º (quinto) dia útil</w:t>
       </w:r>
       <w:r>
         <w:rPr>
           <w:b w:val="0"/>
         </w:rPr>
-        <w:t>, sob a licença sanitária da CONTRATANTE, cabendo à CONTRATADA operar esse espaço em conformidade com as regras acima e manter a área e os equipamentos higienizados após cada uso.</w:t>
+        <w:t xml:space="preserve"> de cada mês, por transferência ou PIX para </w:t>
+      </w:r>
+      <w:r>
+        <w:rPr>
+          <w:b/>
+        </w:rPr>
+        <w:t>conta bancária de titularidade da empresa CONTRATADA, vinculada ao CNPJ 19.525.600/0001-00</w:t>
+      </w:r>
+      <w:r>
+        <w:rPr>
+          <w:b w:val="0"/>
+        </w:rPr>
+        <w:t>. Não haverá pagamento em espécie, em conta de pessoa física, nem parcelado em datas semanais ou quinzenais.</w:t>
       </w:r>
     </w:p>
     <w:p>
@@ -1455,37 +1283,141 @@
         <w:rPr>
           <w:b/>
         </w:rPr>
-        <w:t>7.4.</w:t>
+        <w:t>6.3.1.</w:t>
       </w:r>
       <w:r>
         <w:rPr>
           <w:b w:val="0"/>
         </w:rPr>
-        <w:t xml:space="preserve"> A CONTRATADA manterá </w:t>
+        <w:t xml:space="preserve"> Cada pagamento será identificado com a </w:t>
       </w:r>
       <w:r>
         <w:rPr>
           <w:b/>
         </w:rPr>
-        <w:t>sigilo</w:t>
+        <w:t>competência a que se refere</w:t>
       </w:r>
       <w:r>
         <w:rPr>
           <w:b w:val="0"/>
         </w:rPr>
-        <w:t xml:space="preserve"> sobre dados de hóspedes, senhas, acessos e informações da CONTRATANTE, observando a </w:t>
+        <w:t xml:space="preserve">, e o comprovante de transferência será arquivado pelas duas Partes junto à nota fiscal e ao </w:t>
       </w:r>
       <w:r>
         <w:rPr>
           <w:b/>
         </w:rPr>
-        <w:t>LGPD</w:t>
+        <w:t>Recibo Mensal</w:t>
       </w:r>
       <w:r>
         <w:rPr>
           <w:b w:val="0"/>
         </w:rPr>
-        <w:t>, e não divulgará imagens do empreendimento, de hóspedes ou de colaboradores sem autorização escrita. O sigilo permanece por 5 (cinco) anos após o fim do contrato.</w:t>
+        <w:t xml:space="preserve"> do mesmo mês. Comprovante de pagamento isolado, sem nota fiscal e sem recibo, não substitui a documentação deste contrato.</w:t>
+      </w:r>
+    </w:p>
+    <w:p>
+      <w:r>
+        <w:rPr>
+          <w:b/>
+        </w:rPr>
+        <w:t>6.3.2.</w:t>
+      </w:r>
+      <w:r>
+        <w:rPr>
+          <w:b w:val="0"/>
+        </w:rPr>
+        <w:t xml:space="preserve"> A CONTRATADA entregará o </w:t>
+      </w:r>
+      <w:r>
+        <w:rPr>
+          <w:b/>
+        </w:rPr>
+        <w:t>Recibo Mensal assinado a cada mês</w:t>
+      </w:r>
+      <w:r>
+        <w:rPr>
+          <w:b w:val="0"/>
+        </w:rPr>
+        <w:t>, sem exceção, ainda que o pagamento tenha sido feito antes da entrega. O recibo é a peça que registra a autonomia da prestação e a quitação do período.</w:t>
+      </w:r>
+    </w:p>
+    <w:p>
+      <w:r>
+        <w:rPr>
+          <w:b/>
+        </w:rPr>
+        <w:t>6.4.</w:t>
+      </w:r>
+      <w:r>
+        <w:rPr>
+          <w:b w:val="0"/>
+        </w:rPr>
+        <w:t xml:space="preserve"> Faltando a nota fiscal, o recibo ou as certidões, o pagamento do mês seguinte aguarda a regularização, sem que isso configure atraso. Havendo atraso por parte da CONTRATANTE, incidem multa de 2%, juros de 1% ao mês e correção pelo IPCA.</w:t>
+      </w:r>
+    </w:p>
+    <w:p>
+      <w:r>
+        <w:rPr>
+          <w:b/>
+        </w:rPr>
+        <w:t>6.5.</w:t>
+      </w:r>
+      <w:r>
+        <w:rPr>
+          <w:b w:val="0"/>
+        </w:rPr>
+        <w:t xml:space="preserve"> A CONTRATANTE reterá </w:t>
+      </w:r>
+      <w:r>
+        <w:rPr>
+          <w:b/>
+        </w:rPr>
+        <w:t>5% (cinco por cento)</w:t>
+      </w:r>
+      <w:r>
+        <w:rPr>
+          <w:b w:val="0"/>
+        </w:rPr>
+        <w:t xml:space="preserve"> de cada pagamento, como garantia, devolvidos em parcela única </w:t>
+      </w:r>
+      <w:r>
+        <w:rPr>
+          <w:b/>
+        </w:rPr>
+        <w:t>90 (noventa) dias</w:t>
+      </w:r>
+      <w:r>
+        <w:rPr>
+          <w:b w:val="0"/>
+        </w:rPr>
+        <w:t xml:space="preserve"> após o fim do contrato, mediante CNDT atualizada e comprovação de quitação das verbas dos empregados que atuaram no empreendimento.</w:t>
+      </w:r>
+    </w:p>
+    <w:p>
+      <w:r>
+        <w:rPr>
+          <w:b/>
+        </w:rPr>
+        <w:t>6.6.</w:t>
+      </w:r>
+      <w:r>
+        <w:rPr>
+          <w:b w:val="0"/>
+        </w:rPr>
+        <w:t xml:space="preserve"> Não havendo revisão de comum acordo ao longo do período, o preço é reajustado uma vez por ano, pelo </w:t>
+      </w:r>
+      <w:r>
+        <w:rPr>
+          <w:b/>
+        </w:rPr>
+        <w:t>IPCA/IBGE</w:t>
+      </w:r>
+      <w:r>
+        <w:rPr>
+          <w:b w:val="0"/>
+        </w:rPr>
+        <w:t>, na data de aniversário do contrato.</w:t>
       </w:r>
     </w:p>
     <w:p>
@@ -1507,7 +1439,7 @@
           <w:color w:val="C9A84C"/>
           <w:sz w:val="25"/>
         </w:rPr>
-        <w:t>8. RESPONSABILIDADES DA CONTRATANTE</w:t>
+        <w:t>7. RESPONSABILIDADES DA CONTRATADA</w:t>
       </w:r>
     </w:p>
     <w:p>
@@ -1515,13 +1447,13 @@
         <w:rPr>
           <w:b/>
         </w:rPr>
-        <w:t>8.1.</w:t>
+        <w:t>7.1.</w:t>
       </w:r>
       <w:r>
         <w:rPr>
           <w:b w:val="0"/>
         </w:rPr>
-        <w:t xml:space="preserve"> Pagar nas condições combinadas.</w:t>
+        <w:t xml:space="preserve"> A CONTRATADA responde pelas obrigações trabalhistas, previdenciárias e fiscais de sua equipe, e pelos danos causados ao empreendimento, aos hóspedes ou a terceiros por si, sua equipe ou seus contratados.</w:t>
       </w:r>
     </w:p>
     <w:p>
@@ -1529,13 +1461,37 @@
         <w:rPr>
           <w:b/>
         </w:rPr>
-        <w:t>8.2.</w:t>
+        <w:t>7.2.</w:t>
       </w:r>
       <w:r>
         <w:rPr>
           <w:b w:val="0"/>
         </w:rPr>
-        <w:t xml:space="preserve"> Dar acesso às áreas necessárias e fornecer, sem custo, água, energia e local para guarda de materiais.</w:t>
+        <w:t xml:space="preserve"> Se a CONTRATANTE for demandada ou autuada por fato decorrente deste contrato, inclusive por pessoa da equipe da CONTRATADA, esta </w:t>
+      </w:r>
+      <w:r>
+        <w:rPr>
+          <w:b/>
+        </w:rPr>
+        <w:t>ressarcirá os valores despendidos</w:t>
+      </w:r>
+      <w:r>
+        <w:rPr>
+          <w:b w:val="0"/>
+        </w:rPr>
+        <w:t xml:space="preserve"> — principal, encargos, custas e honorários — em até </w:t>
+      </w:r>
+      <w:r>
+        <w:rPr>
+          <w:b/>
+        </w:rPr>
+        <w:t>10 (dez) dias</w:t>
+      </w:r>
+      <w:r>
+        <w:rPr>
+          <w:b w:val="0"/>
+        </w:rPr>
+        <w:t xml:space="preserve"> da comprovação, e colaborará com a defesa fornecendo os documentos necessários. A CONTRATANTE poderá compensar esses valores com créditos da CONTRATADA, inclusive com a garantia da Cláusula 6.5. Esta obrigação permanece após o fim do contrato.</w:t>
       </w:r>
     </w:p>
     <w:p>
@@ -1543,39 +1499,45 @@
         <w:rPr>
           <w:b/>
         </w:rPr>
-        <w:t>8.3.</w:t>
+        <w:t>7.3.</w:t>
       </w:r>
       <w:r>
         <w:rPr>
           <w:b w:val="0"/>
         </w:rPr>
-        <w:t xml:space="preserve"> Avisar com pelo menos </w:t>
+        <w:t xml:space="preserve"> No serviço de alimentos e bebidas, a CONTRATADA seguirá a </w:t>
       </w:r>
       <w:r>
         <w:rPr>
           <w:b/>
         </w:rPr>
-        <w:t>5 (cinco) dias</w:t>
+        <w:t>RDC ANVISA nº 216/2004</w:t>
       </w:r>
       <w:r>
         <w:rPr>
           <w:b w:val="0"/>
         </w:rPr>
-        <w:t xml:space="preserve"> de antecedência sobre eventos, alta ocupação ou qualquer situação que altere bastante o volume de serviço.</w:t>
+        <w:t>, mantendo boas práticas, curso de manipulador e atestado de saúde da equipe em dia, controle de temperatura, guarda de amostras por 72 horas e informação de alergênicos. Não servirá bebida alcoólica a menor de 18 anos. Responde pelos danos à saúde decorrentes dos alimentos que preparar ou servir.</w:t>
       </w:r>
     </w:p>
     <w:p>
       <w:r>
         <w:rPr>
+          <w:b w:val="0"/>
+        </w:rPr>
+        <w:t xml:space="preserve">Os alimentos serão preparados na </w:t>
+      </w:r>
+      <w:r>
+        <w:rPr>
           <w:b/>
         </w:rPr>
-        <w:t>8.4.</w:t>
+        <w:t>copa da cozinha do empreendimento, ao lado da recepção</w:t>
       </w:r>
       <w:r>
         <w:rPr>
           <w:b w:val="0"/>
         </w:rPr>
-        <w:t xml:space="preserve"> Manter as instalações em condições seguras.</w:t>
+        <w:t>, sob a licença sanitária da CONTRATANTE, cabendo à CONTRATADA operar esse espaço em conformidade com as regras acima e manter a área e os equipamentos higienizados após cada uso.</w:t>
       </w:r>
     </w:p>
     <w:p>
@@ -1583,27 +1545,37 @@
         <w:rPr>
           <w:b/>
         </w:rPr>
-        <w:t>8.5.</w:t>
+        <w:t>7.4.</w:t>
       </w:r>
       <w:r>
         <w:rPr>
           <w:b w:val="0"/>
         </w:rPr>
-        <w:t xml:space="preserve"> Falar sempre com o Preposto, e não com as pessoas da equipe.</w:t>
-      </w:r>
-    </w:p>
-    <w:p>
+        <w:t xml:space="preserve"> A CONTRATADA manterá </w:t>
+      </w:r>
       <w:r>
         <w:rPr>
           <w:b/>
         </w:rPr>
-        <w:t>8.6.</w:t>
+        <w:t>sigilo</w:t>
       </w:r>
       <w:r>
         <w:rPr>
           <w:b w:val="0"/>
         </w:rPr>
-        <w:t xml:space="preserve"> Não contratar diretamente, durante o contrato e por 12 (doze) meses depois, pessoas da equipe da CONTRATADA — assim como a CONTRATADA não contratará pessoas da equipe da CONTRATANTE.</w:t>
+        <w:t xml:space="preserve"> sobre dados de hóspedes, senhas, acessos e informações da CONTRATANTE, observando a </w:t>
+      </w:r>
+      <w:r>
+        <w:rPr>
+          <w:b/>
+        </w:rPr>
+        <w:t>LGPD</w:t>
+      </w:r>
+      <w:r>
+        <w:rPr>
+          <w:b w:val="0"/>
+        </w:rPr>
+        <w:t>, e não divulgará imagens do empreendimento, de hóspedes ou de colaboradores sem autorização escrita. O sigilo permanece por 5 (cinco) anos após o fim do contrato.</w:t>
       </w:r>
     </w:p>
     <w:p>
@@ -1625,7 +1597,7 @@
           <w:color w:val="C9A84C"/>
           <w:sz w:val="25"/>
         </w:rPr>
-        <w:t>9. A CASA DE OPERAÇÕES</w:t>
+        <w:t>8. RESPONSABILIDADES DA CONTRATANTE</w:t>
       </w:r>
     </w:p>
     <w:p>
@@ -1633,61 +1605,13 @@
         <w:rPr>
           <w:b/>
         </w:rPr>
-        <w:t>9.1.</w:t>
+        <w:t>8.1.</w:t>
       </w:r>
       <w:r>
         <w:rPr>
           <w:b w:val="0"/>
         </w:rPr>
-        <w:t xml:space="preserve"> A operação do empreendimento exige </w:t>
-      </w:r>
-      <w:r>
-        <w:rPr>
-          <w:b/>
-        </w:rPr>
-        <w:t>presença ao longo de todo o horário de atendimento</w:t>
-      </w:r>
-      <w:r>
-        <w:rPr>
-          <w:b w:val="0"/>
-        </w:rPr>
-        <w:t xml:space="preserve">, recebimento de chegadas fora desse horário e atuação imediata diante de intercorrências com hóspedes e nas instalações. É por essa </w:t>
-      </w:r>
-      <w:r>
-        <w:rPr>
-          <w:b/>
-        </w:rPr>
-        <w:t>razão operacional</w:t>
-      </w:r>
-      <w:r>
-        <w:rPr>
-          <w:b w:val="0"/>
-        </w:rPr>
-        <w:t xml:space="preserve">, e enquanto durar este contrato, que a CONTRATANTE cede à CONTRATADA, </w:t>
-      </w:r>
-      <w:r>
-        <w:rPr>
-          <w:b/>
-        </w:rPr>
-        <w:t>gratuitamente</w:t>
-      </w:r>
-      <w:r>
-        <w:rPr>
-          <w:b w:val="0"/>
-        </w:rPr>
-        <w:t xml:space="preserve">, o uso da unidade chamada </w:t>
-      </w:r>
-      <w:r>
-        <w:rPr>
-          <w:b/>
-        </w:rPr>
-        <w:t>Casa de Operações</w:t>
-      </w:r>
-      <w:r>
-        <w:rPr>
-          <w:b w:val="0"/>
-        </w:rPr>
-        <w:t>, situada no próprio empreendimento.</w:t>
+        <w:t xml:space="preserve"> Pagar nas condições combinadas.</w:t>
       </w:r>
     </w:p>
     <w:p>
@@ -1695,49 +1619,13 @@
         <w:rPr>
           <w:b/>
         </w:rPr>
-        <w:t>9.2.</w:t>
+        <w:t>8.2.</w:t>
       </w:r>
       <w:r>
         <w:rPr>
           <w:b w:val="0"/>
         </w:rPr>
-        <w:t xml:space="preserve"> A cessão é um </w:t>
-      </w:r>
-      <w:r>
-        <w:rPr>
-          <w:b/>
-        </w:rPr>
-        <w:t>comodato</w:t>
-      </w:r>
-      <w:r>
-        <w:rPr>
-          <w:b w:val="0"/>
-        </w:rPr>
-        <w:t xml:space="preserve"> vinculado ao contrato de serviços. As Partes deixam claro que ela é concedida </w:t>
-      </w:r>
-      <w:r>
-        <w:rPr>
-          <w:b/>
-        </w:rPr>
-        <w:t>para o trabalho</w:t>
-      </w:r>
-      <w:r>
-        <w:rPr>
-          <w:b w:val="0"/>
-        </w:rPr>
-        <w:t xml:space="preserve">, como ferramenta necessária à prestação, e </w:t>
-      </w:r>
-      <w:r>
-        <w:rPr>
-          <w:b/>
-        </w:rPr>
-        <w:t>não como pagamento</w:t>
-      </w:r>
-      <w:r>
-        <w:rPr>
-          <w:b w:val="0"/>
-        </w:rPr>
-        <w:t>: não é aluguel, não é remuneração, não entrou na formação do preço da Cláusula 6.1, e não transfere posse do imóvel.</w:t>
+        <w:t xml:space="preserve"> Dar acesso às áreas necessárias e fornecer, sem custo, água, energia e local para guarda de materiais.</w:t>
       </w:r>
     </w:p>
     <w:p>
@@ -1745,13 +1633,25 @@
         <w:rPr>
           <w:b/>
         </w:rPr>
-        <w:t>9.3.</w:t>
+        <w:t>8.3.</w:t>
       </w:r>
       <w:r>
         <w:rPr>
           <w:b w:val="0"/>
         </w:rPr>
-        <w:t xml:space="preserve"> Podem ocupar a unidade apenas as pessoas indicadas por escrito e aceitas pela CONTRATANTE. Não é permitido emprestar ou ceder a unidade, hospedar terceiros, exercer atividade comercial, fazer obras, manter animais sem combinar antes, ou usar o endereço como sede da empresa.</w:t>
+        <w:t xml:space="preserve"> Avisar com pelo menos </w:t>
+      </w:r>
+      <w:r>
+        <w:rPr>
+          <w:b/>
+        </w:rPr>
+        <w:t>5 (cinco) dias</w:t>
+      </w:r>
+      <w:r>
+        <w:rPr>
+          <w:b w:val="0"/>
+        </w:rPr>
+        <w:t xml:space="preserve"> de antecedência sobre eventos, alta ocupação ou qualquer situação que altere bastante o volume de serviço.</w:t>
       </w:r>
     </w:p>
     <w:p>
@@ -1759,13 +1659,13 @@
         <w:rPr>
           <w:b/>
         </w:rPr>
-        <w:t>9.4.</w:t>
+        <w:t>8.4.</w:t>
       </w:r>
       <w:r>
         <w:rPr>
           <w:b w:val="0"/>
         </w:rPr>
-        <w:t xml:space="preserve"> Melhorias feitas na unidade ficam incorporadas ao imóvel, sem indenização ou retenção.</w:t>
+        <w:t xml:space="preserve"> Manter as instalações em condições seguras.</w:t>
       </w:r>
     </w:p>
     <w:p>
@@ -1773,25 +1673,13 @@
         <w:rPr>
           <w:b/>
         </w:rPr>
-        <w:t>9.5.</w:t>
+        <w:t>8.5.</w:t>
       </w:r>
       <w:r>
         <w:rPr>
           <w:b w:val="0"/>
         </w:rPr>
-        <w:t xml:space="preserve"> Na entrada e na saída será feita uma </w:t>
-      </w:r>
-      <w:r>
-        <w:rPr>
-          <w:b/>
-        </w:rPr>
-        <w:t>vistoria com fotos</w:t>
-      </w:r>
-      <w:r>
-        <w:rPr>
-          <w:b w:val="0"/>
-        </w:rPr>
-        <w:t>, assinada pelas duas Partes. A CONTRATADA responde pelos danos além do desgaste natural.</w:t>
+        <w:t xml:space="preserve"> Falar sempre com o Preposto, e não com as pessoas da equipe.</w:t>
       </w:r>
     </w:p>
     <w:p>
@@ -1799,133 +1687,13 @@
         <w:rPr>
           <w:b/>
         </w:rPr>
-        <w:t>9.6.</w:t>
+        <w:t>8.6.</w:t>
       </w:r>
       <w:r>
         <w:rPr>
           <w:b w:val="0"/>
         </w:rPr>
-        <w:t xml:space="preserve"> A CONTRATADA pode usar a unidade </w:t>
-      </w:r>
-      <w:r>
-        <w:rPr>
-          <w:b/>
-        </w:rPr>
-        <w:t>enquanto este contrato estiver em vigor</w:t>
-      </w:r>
-      <w:r>
-        <w:rPr>
-          <w:b w:val="0"/>
-        </w:rPr>
-        <w:t xml:space="preserve">. Terminado o contrato, por qualquer motivo, a cessão termina junto, e a CONTRATADA devolverá a unidade desocupada e em ordem em </w:t>
-      </w:r>
-      <w:r>
-        <w:rPr>
-          <w:b/>
-        </w:rPr>
-        <w:t>30 (trinta) dias corridos</w:t>
-      </w:r>
-      <w:r>
-        <w:rPr>
-          <w:b w:val="0"/>
-        </w:rPr>
-        <w:t>, entregando as chaves. Esse prazo corre em paralelo ao aviso prévio da Cláusula 10.2, de modo que a desmobilização comece já no aviso.</w:t>
-      </w:r>
-    </w:p>
-    <w:p>
-      <w:r>
-        <w:rPr>
-          <w:b/>
-        </w:rPr>
-        <w:t>9.6.1.</w:t>
-      </w:r>
-      <w:r>
-        <w:rPr>
-          <w:b w:val="0"/>
-        </w:rPr>
-        <w:t xml:space="preserve"> Passados os 30 (trinta) dias sem a devolução, será devida </w:t>
-      </w:r>
-      <w:r>
-        <w:rPr>
-          <w:b/>
-        </w:rPr>
-        <w:t>multa de R$ 100,00 (cem reais) por dia de atraso</w:t>
-      </w:r>
-      <w:r>
-        <w:rPr>
-          <w:b w:val="0"/>
-        </w:rPr>
-        <w:t xml:space="preserve">, até a efetiva desocupação, podendo a CONTRATANTE retomar o imóvel judicialmente, com as despesas dessa retomada por conta da CONTRATADA. </w:t>
-      </w:r>
-      <w:r>
-        <w:rPr>
-          <w:b/>
-        </w:rPr>
-        <w:t>Devolvida a unidade no prazo, nada é devido.</w:t>
-      </w:r>
-    </w:p>
-    <w:p>
-      <w:r>
-        <w:rPr>
-          <w:b/>
-        </w:rPr>
-        <w:t>9.7. Despesas de consumo.</w:t>
-      </w:r>
-      <w:r>
-        <w:rPr>
-          <w:b w:val="0"/>
-        </w:rPr>
-        <w:t xml:space="preserve"> As instalações da unidade estão ligadas às redes do próprio empreendimento, razão pela qual </w:t>
-      </w:r>
-      <w:r>
-        <w:rPr>
-          <w:b/>
-        </w:rPr>
-        <w:t>energia elétrica, água e internet correm por conta da CONTRATANTE</w:t>
-      </w:r>
-      <w:r>
-        <w:rPr>
-          <w:b w:val="0"/>
-        </w:rPr>
-        <w:t xml:space="preserve">, como parte da infraestrutura operacional cedida junto com a unidade. Essas despesas seguem a mesma natureza da cessão: são </w:t>
-      </w:r>
-      <w:r>
-        <w:rPr>
-          <w:b/>
-        </w:rPr>
-        <w:t>instrumentais à prestação, e não pagamento, benefício ou parcela remuneratória</w:t>
-      </w:r>
-      <w:r>
-        <w:rPr>
-          <w:b w:val="0"/>
-        </w:rPr>
-        <w:t>, não tendo sido consideradas na formação do preço da Cláusula 6.1. A limpeza e a conservação interna da unidade ficam por conta da CONTRATADA, que se obriga ao uso moderado dos serviços, desligando equipamentos quando ausente e comunicando de imediato qualquer vazamento ou falha.</w:t>
-      </w:r>
-    </w:p>
-    <w:p>
-      <w:r>
-        <w:rPr>
-          <w:b/>
-        </w:rPr>
-        <w:t>9.8.</w:t>
-      </w:r>
-      <w:r>
-        <w:rPr>
-          <w:b w:val="0"/>
-        </w:rPr>
-        <w:t xml:space="preserve"> A CONTRATANTE pode encerrar a cessão da casa isoladamente, mantendo o contrato de serviços, mediante </w:t>
-      </w:r>
-      <w:r>
-        <w:rPr>
-          <w:b/>
-        </w:rPr>
-        <w:t>aviso escrito de 30 (trinta) dias</w:t>
-      </w:r>
-      <w:r>
-        <w:rPr>
-          <w:b w:val="0"/>
-        </w:rPr>
-        <w:t>, admitida a notificação extrajudicial. Nesse caso o preço, o serviço e o prazo deste contrato permanecem inalterados.</w:t>
+        <w:t xml:space="preserve"> Não contratar diretamente, durante o contrato e por 12 (doze) meses depois, pessoas da equipe da CONTRATADA — assim como a CONTRATADA não contratará pessoas da equipe da CONTRATANTE.</w:t>
       </w:r>
     </w:p>
     <w:p>
@@ -1947,7 +1715,7 @@
           <w:color w:val="C9A84C"/>
           <w:sz w:val="25"/>
         </w:rPr>
-        <w:t>10. PRAZO E AVISO PRÉVIO</w:t>
+        <w:t>9. A CASA DE OPERAÇÕES</w:t>
       </w:r>
     </w:p>
     <w:p>
@@ -1955,37 +1723,61 @@
         <w:rPr>
           <w:b/>
         </w:rPr>
-        <w:t>10.1.</w:t>
+        <w:t>9.1.</w:t>
       </w:r>
       <w:r>
         <w:rPr>
           <w:b w:val="0"/>
         </w:rPr>
-        <w:t xml:space="preserve"> O contrato começa a valer </w:t>
+        <w:t xml:space="preserve"> A operação do empreendimento exige </w:t>
       </w:r>
       <w:r>
         <w:rPr>
           <w:b/>
         </w:rPr>
-        <w:t>na data de sua assinatura</w:t>
+        <w:t>presença ao longo de todo o horário de atendimento</w:t>
       </w:r>
       <w:r>
         <w:rPr>
           <w:b w:val="0"/>
         </w:rPr>
-        <w:t xml:space="preserve"> e vale por </w:t>
+        <w:t xml:space="preserve">, recebimento de chegadas fora desse horário e atuação imediata diante de intercorrências com hóspedes e nas instalações. É por essa </w:t>
       </w:r>
       <w:r>
         <w:rPr>
           <w:b/>
         </w:rPr>
-        <w:t>12 (doze) meses</w:t>
+        <w:t>razão operacional</w:t>
       </w:r>
       <w:r>
         <w:rPr>
           <w:b w:val="0"/>
         </w:rPr>
-        <w:t>, renovando-se automaticamente por períodos iguais se nenhuma das Partes avisar o contrário.</w:t>
+        <w:t xml:space="preserve">, e enquanto durar este contrato, que a CONTRATANTE cede à CONTRATADA, </w:t>
+      </w:r>
+      <w:r>
+        <w:rPr>
+          <w:b/>
+        </w:rPr>
+        <w:t>gratuitamente</w:t>
+      </w:r>
+      <w:r>
+        <w:rPr>
+          <w:b w:val="0"/>
+        </w:rPr>
+        <w:t xml:space="preserve">, o uso da unidade chamada </w:t>
+      </w:r>
+      <w:r>
+        <w:rPr>
+          <w:b/>
+        </w:rPr>
+        <w:t>Casa de Operações</w:t>
+      </w:r>
+      <w:r>
+        <w:rPr>
+          <w:b w:val="0"/>
+        </w:rPr>
+        <w:t>, situada no próprio empreendimento.</w:t>
       </w:r>
     </w:p>
     <w:p>
@@ -1993,25 +1785,49 @@
         <w:rPr>
           <w:b/>
         </w:rPr>
-        <w:t>10.2.</w:t>
+        <w:t>9.2.</w:t>
       </w:r>
       <w:r>
         <w:rPr>
           <w:b w:val="0"/>
         </w:rPr>
-        <w:t xml:space="preserve"> Qualquer das Partes pode encerrar o contrato quando quiser, sem precisar justificar, </w:t>
+        <w:t xml:space="preserve"> A cessão é um </w:t>
       </w:r>
       <w:r>
         <w:rPr>
           <w:b/>
         </w:rPr>
-        <w:t>avisando a outra por escrito com 60 (sessenta) dias de antecedência</w:t>
+        <w:t>comodato</w:t>
       </w:r>
       <w:r>
         <w:rPr>
           <w:b w:val="0"/>
         </w:rPr>
-        <w:t>.</w:t>
+        <w:t xml:space="preserve"> vinculado ao contrato de serviços. As Partes deixam claro que ela é concedida </w:t>
+      </w:r>
+      <w:r>
+        <w:rPr>
+          <w:b/>
+        </w:rPr>
+        <w:t>para o trabalho</w:t>
+      </w:r>
+      <w:r>
+        <w:rPr>
+          <w:b w:val="0"/>
+        </w:rPr>
+        <w:t xml:space="preserve">, como ferramenta necessária à prestação, e </w:t>
+      </w:r>
+      <w:r>
+        <w:rPr>
+          <w:b/>
+        </w:rPr>
+        <w:t>não como pagamento</w:t>
+      </w:r>
+      <w:r>
+        <w:rPr>
+          <w:b w:val="0"/>
+        </w:rPr>
+        <w:t>: não é aluguel, não é remuneração, não entrou na formação do preço da Cláusula 6.1, e não transfere posse do imóvel.</w:t>
       </w:r>
     </w:p>
     <w:p>
@@ -2019,13 +1835,13 @@
         <w:rPr>
           <w:b/>
         </w:rPr>
-        <w:t>10.3.</w:t>
+        <w:t>9.3.</w:t>
       </w:r>
       <w:r>
         <w:rPr>
           <w:b w:val="0"/>
         </w:rPr>
-        <w:t xml:space="preserve"> Durante esse período de aviso, tudo segue normalmente: a CONTRATADA mantém o padrão, a frequência e a equipe, entrega em até 15 (quinze) dias o inventário de chaves, acessos e bens, repassa as rotinas e os contatos de fornecedores, e acompanha por até 10 (dez) dias a equipe que assumir.</w:t>
+        <w:t xml:space="preserve"> Podem ocupar a unidade apenas as pessoas indicadas por escrito e aceitas pela CONTRATANTE. Não é permitido emprestar ou ceder a unidade, hospedar terceiros, exercer atividade comercial, fazer obras, manter animais sem combinar antes, ou usar o endereço como sede da empresa.</w:t>
       </w:r>
     </w:p>
     <w:p>
@@ -2033,25 +1849,13 @@
         <w:rPr>
           <w:b/>
         </w:rPr>
-        <w:t>10.4.</w:t>
+        <w:t>9.4.</w:t>
       </w:r>
       <w:r>
         <w:rPr>
           <w:b w:val="0"/>
         </w:rPr>
-        <w:t xml:space="preserve"> Quem encerrar sem cumprir o aviso paga à outra Parte o </w:t>
-      </w:r>
-      <w:r>
-        <w:rPr>
-          <w:b/>
-        </w:rPr>
-        <w:t>equivalente a 2 (duas) mensalidades</w:t>
-      </w:r>
-      <w:r>
-        <w:rPr>
-          <w:b w:val="0"/>
-        </w:rPr>
-        <w:t>, proporcional ao tempo que faltou.</w:t>
+        <w:t xml:space="preserve"> Melhorias feitas na unidade ficam incorporadas ao imóvel, sem indenização ou retenção.</w:t>
       </w:r>
     </w:p>
     <w:p>
@@ -2059,25 +1863,159 @@
         <w:rPr>
           <w:b/>
         </w:rPr>
-        <w:t>10.5.</w:t>
+        <w:t>9.5.</w:t>
       </w:r>
       <w:r>
         <w:rPr>
           <w:b w:val="0"/>
         </w:rPr>
-        <w:t xml:space="preserve"> Por conta da temporada, o aviso dado pela CONTRATADA </w:t>
+        <w:t xml:space="preserve"> Na entrada e na saída será feita uma </w:t>
       </w:r>
       <w:r>
         <w:rPr>
           <w:b/>
         </w:rPr>
-        <w:t>não vence entre 15 de dezembro e 28 de fevereiro</w:t>
+        <w:t>vistoria com fotos</w:t>
       </w:r>
       <w:r>
         <w:rPr>
           <w:b w:val="0"/>
         </w:rPr>
-        <w:t>: nesse caso o prazo se estende até o primeiro dia útil de março, com o contrato e o pagamento mantidos.</w:t>
+        <w:t>, assinada pelas duas Partes. A CONTRATADA responde pelos danos além do desgaste natural.</w:t>
+      </w:r>
+    </w:p>
+    <w:p>
+      <w:r>
+        <w:rPr>
+          <w:b/>
+        </w:rPr>
+        <w:t>9.6.</w:t>
+      </w:r>
+      <w:r>
+        <w:rPr>
+          <w:b w:val="0"/>
+        </w:rPr>
+        <w:t xml:space="preserve"> A CONTRATADA pode usar a unidade </w:t>
+      </w:r>
+      <w:r>
+        <w:rPr>
+          <w:b/>
+        </w:rPr>
+        <w:t>enquanto este contrato estiver em vigor</w:t>
+      </w:r>
+      <w:r>
+        <w:rPr>
+          <w:b w:val="0"/>
+        </w:rPr>
+        <w:t xml:space="preserve">. Terminado o contrato, por qualquer motivo, a cessão termina junto, e a CONTRATADA devolverá a unidade desocupada e em ordem em </w:t>
+      </w:r>
+      <w:r>
+        <w:rPr>
+          <w:b/>
+        </w:rPr>
+        <w:t>30 (trinta) dias corridos</w:t>
+      </w:r>
+      <w:r>
+        <w:rPr>
+          <w:b w:val="0"/>
+        </w:rPr>
+        <w:t>, entregando as chaves. Esse prazo corre em paralelo ao aviso prévio da Cláusula 10.2, de modo que a desmobilização comece já no aviso.</w:t>
+      </w:r>
+    </w:p>
+    <w:p>
+      <w:r>
+        <w:rPr>
+          <w:b/>
+        </w:rPr>
+        <w:t>9.6.1.</w:t>
+      </w:r>
+      <w:r>
+        <w:rPr>
+          <w:b w:val="0"/>
+        </w:rPr>
+        <w:t xml:space="preserve"> Passados os 30 (trinta) dias sem a devolução, será devida </w:t>
+      </w:r>
+      <w:r>
+        <w:rPr>
+          <w:b/>
+        </w:rPr>
+        <w:t>multa de R$ 100,00 (cem reais) por dia de atraso</w:t>
+      </w:r>
+      <w:r>
+        <w:rPr>
+          <w:b w:val="0"/>
+        </w:rPr>
+        <w:t xml:space="preserve">, até a efetiva desocupação, podendo a CONTRATANTE retomar o imóvel judicialmente, com as despesas dessa retomada por conta da CONTRATADA. </w:t>
+      </w:r>
+      <w:r>
+        <w:rPr>
+          <w:b/>
+        </w:rPr>
+        <w:t>Devolvida a unidade no prazo, nada é devido.</w:t>
+      </w:r>
+    </w:p>
+    <w:p>
+      <w:r>
+        <w:rPr>
+          <w:b/>
+        </w:rPr>
+        <w:t>9.7. Despesas de consumo.</w:t>
+      </w:r>
+      <w:r>
+        <w:rPr>
+          <w:b w:val="0"/>
+        </w:rPr>
+        <w:t xml:space="preserve"> As instalações da unidade estão ligadas às redes do próprio empreendimento, razão pela qual </w:t>
+      </w:r>
+      <w:r>
+        <w:rPr>
+          <w:b/>
+        </w:rPr>
+        <w:t>energia elétrica, água e internet correm por conta da CONTRATANTE</w:t>
+      </w:r>
+      <w:r>
+        <w:rPr>
+          <w:b w:val="0"/>
+        </w:rPr>
+        <w:t xml:space="preserve">, como parte da infraestrutura operacional cedida junto com a unidade. Essas despesas seguem a mesma natureza da cessão: são </w:t>
+      </w:r>
+      <w:r>
+        <w:rPr>
+          <w:b/>
+        </w:rPr>
+        <w:t>instrumentais à prestação, e não pagamento, benefício ou parcela remuneratória</w:t>
+      </w:r>
+      <w:r>
+        <w:rPr>
+          <w:b w:val="0"/>
+        </w:rPr>
+        <w:t>, não tendo sido consideradas na formação do preço da Cláusula 6.1. A limpeza e a conservação interna da unidade ficam por conta da CONTRATADA, que se obriga ao uso moderado dos serviços, desligando equipamentos quando ausente e comunicando de imediato qualquer vazamento ou falha.</w:t>
+      </w:r>
+    </w:p>
+    <w:p>
+      <w:r>
+        <w:rPr>
+          <w:b/>
+        </w:rPr>
+        <w:t>9.8.</w:t>
+      </w:r>
+      <w:r>
+        <w:rPr>
+          <w:b w:val="0"/>
+        </w:rPr>
+        <w:t xml:space="preserve"> A CONTRATANTE pode encerrar a cessão da casa isoladamente, mantendo o contrato de serviços, mediante </w:t>
+      </w:r>
+      <w:r>
+        <w:rPr>
+          <w:b/>
+        </w:rPr>
+        <w:t>aviso escrito de 30 (trinta) dias</w:t>
+      </w:r>
+      <w:r>
+        <w:rPr>
+          <w:b w:val="0"/>
+        </w:rPr>
+        <w:t>, admitida a notificação extrajudicial. Nesse caso o preço, o serviço e o prazo deste contrato permanecem inalterados.</w:t>
       </w:r>
     </w:p>
     <w:p>
@@ -2099,7 +2037,7 @@
           <w:color w:val="C9A84C"/>
           <w:sz w:val="25"/>
         </w:rPr>
-        <w:t>11. ENCERRAMENTO ANTES DO PRAZO</w:t>
+        <w:t>10. PRAZO E AVISO PRÉVIO</w:t>
       </w:r>
     </w:p>
     <w:p>
@@ -2107,25 +2045,37 @@
         <w:rPr>
           <w:b/>
         </w:rPr>
-        <w:t>11.1.</w:t>
+        <w:t>10.1.</w:t>
       </w:r>
       <w:r>
         <w:rPr>
           <w:b w:val="0"/>
         </w:rPr>
-        <w:t xml:space="preserve"> O contrato pode ser encerrado </w:t>
+        <w:t xml:space="preserve"> O contrato começa a valer </w:t>
       </w:r>
       <w:r>
         <w:rPr>
           <w:b/>
         </w:rPr>
-        <w:t>imediatamente</w:t>
+        <w:t>na data de sua assinatura</w:t>
       </w:r>
       <w:r>
         <w:rPr>
           <w:b w:val="0"/>
         </w:rPr>
-        <w:t>, sem aviso prévio, se houver: descumprimento do padrão de serviço após duas notificações escritas em 90 (noventa) dias; atraso nas obrigações trabalhistas ou fiscais da CONTRATADA; pessoa trabalhando sem formalização; furto, dano intencional, agressão, assédio, embriaguez ou uso de entorpecente em serviço; quebra de sigilo; descumprimento das regras da Casa de Operações; ou parada dos serviços por mais de 48 (quarenta e oito) horas sem justificativa.</w:t>
+        <w:t xml:space="preserve"> e vale por </w:t>
+      </w:r>
+      <w:r>
+        <w:rPr>
+          <w:b/>
+        </w:rPr>
+        <w:t>12 (doze) meses</w:t>
+      </w:r>
+      <w:r>
+        <w:rPr>
+          <w:b w:val="0"/>
+        </w:rPr>
+        <w:t>, renovando-se automaticamente por períodos iguais se nenhuma das Partes avisar o contrário.</w:t>
       </w:r>
     </w:p>
     <w:p>
@@ -2133,13 +2083,25 @@
         <w:rPr>
           <w:b/>
         </w:rPr>
-        <w:t>11.2.</w:t>
+        <w:t>10.2.</w:t>
       </w:r>
       <w:r>
         <w:rPr>
           <w:b w:val="0"/>
         </w:rPr>
-        <w:t xml:space="preserve"> A CONTRATADA pode encerrar imediatamente se o pagamento atrasar mais de 30 (trinta) dias, estando sua documentação regular, após aviso com 10 (dez) dias para regularização.</w:t>
+        <w:t xml:space="preserve"> Qualquer das Partes pode encerrar o contrato quando quiser, sem precisar justificar, </w:t>
+      </w:r>
+      <w:r>
+        <w:rPr>
+          <w:b/>
+        </w:rPr>
+        <w:t>avisando a outra por escrito com 60 (sessenta) dias de antecedência</w:t>
+      </w:r>
+      <w:r>
+        <w:rPr>
+          <w:b w:val="0"/>
+        </w:rPr>
+        <w:t>.</w:t>
       </w:r>
     </w:p>
     <w:p>
@@ -2147,13 +2109,13 @@
         <w:rPr>
           <w:b/>
         </w:rPr>
-        <w:t>11.3.</w:t>
+        <w:t>10.3.</w:t>
       </w:r>
       <w:r>
         <w:rPr>
           <w:b w:val="0"/>
         </w:rPr>
-        <w:t xml:space="preserve"> Encerrado o contrato: a cessão da casa termina junto (Cláusula 9.6); a CONTRATADA devolve em 48 (quarenta e oito) horas chaves, acessos e bens da CONTRATANTE; e as Partes acertam as contas em até 30 (trinta) dias.</w:t>
+        <w:t xml:space="preserve"> Durante esse período de aviso, tudo segue normalmente: a CONTRATADA mantém o padrão, a frequência e a equipe, entrega em até 15 (quinze) dias o inventário de chaves, acessos e bens, repassa as rotinas e os contatos de fornecedores, e acompanha por até 10 (dez) dias a equipe que assumir.</w:t>
       </w:r>
     </w:p>
     <w:p>
@@ -2161,13 +2123,51 @@
         <w:rPr>
           <w:b/>
         </w:rPr>
-        <w:t>11.4.</w:t>
+        <w:t>10.4.</w:t>
       </w:r>
       <w:r>
         <w:rPr>
           <w:b w:val="0"/>
         </w:rPr>
-        <w:t xml:space="preserve"> Encerramentos por descumprimento não afastam a responsabilidade pelos prejuízos causados.</w:t>
+        <w:t xml:space="preserve"> Quem encerrar sem cumprir o aviso paga à outra Parte o </w:t>
+      </w:r>
+      <w:r>
+        <w:rPr>
+          <w:b/>
+        </w:rPr>
+        <w:t>equivalente a 2 (duas) mensalidades</w:t>
+      </w:r>
+      <w:r>
+        <w:rPr>
+          <w:b w:val="0"/>
+        </w:rPr>
+        <w:t>, proporcional ao tempo que faltou.</w:t>
+      </w:r>
+    </w:p>
+    <w:p>
+      <w:r>
+        <w:rPr>
+          <w:b/>
+        </w:rPr>
+        <w:t>10.5.</w:t>
+      </w:r>
+      <w:r>
+        <w:rPr>
+          <w:b w:val="0"/>
+        </w:rPr>
+        <w:t xml:space="preserve"> Por conta da temporada, o aviso dado pela CONTRATADA </w:t>
+      </w:r>
+      <w:r>
+        <w:rPr>
+          <w:b/>
+        </w:rPr>
+        <w:t>não vence entre 15 de dezembro e 28 de fevereiro</w:t>
+      </w:r>
+      <w:r>
+        <w:rPr>
+          <w:b w:val="0"/>
+        </w:rPr>
+        <w:t>: nesse caso o prazo se estende até o primeiro dia útil de março, com o contrato e o pagamento mantidos.</w:t>
       </w:r>
     </w:p>
     <w:p>
@@ -2189,7 +2189,7 @@
           <w:color w:val="C9A84C"/>
           <w:sz w:val="25"/>
         </w:rPr>
-        <w:t>12. DISPOSIÇÕES FINAIS</w:t>
+        <w:t>11. ENCERRAMENTO ANTES DO PRAZO</w:t>
       </w:r>
     </w:p>
     <w:p>
@@ -2197,49 +2197,25 @@
         <w:rPr>
           <w:b/>
         </w:rPr>
-        <w:t>12.1.</w:t>
+        <w:t>11.1.</w:t>
       </w:r>
       <w:r>
         <w:rPr>
           <w:b w:val="0"/>
         </w:rPr>
-        <w:t xml:space="preserve"> Este contrato, com o </w:t>
+        <w:t xml:space="preserve"> O contrato pode ser encerrado </w:t>
       </w:r>
       <w:r>
         <w:rPr>
           <w:b/>
         </w:rPr>
-        <w:t>Plano de Cobertura</w:t>
+        <w:t>imediatamente</w:t>
       </w:r>
       <w:r>
         <w:rPr>
           <w:b w:val="0"/>
         </w:rPr>
-        <w:t xml:space="preserve"> e o </w:t>
-      </w:r>
-      <w:r>
-        <w:rPr>
-          <w:b/>
-        </w:rPr>
-        <w:t>Recibo Mensal</w:t>
-      </w:r>
-      <w:r>
-        <w:rPr>
-          <w:b w:val="0"/>
-        </w:rPr>
-        <w:t xml:space="preserve"> anexos, reúne tudo o que foi combinado e só muda por </w:t>
-      </w:r>
-      <w:r>
-        <w:rPr>
-          <w:b/>
-        </w:rPr>
-        <w:t>aditivo escrito</w:t>
-      </w:r>
-      <w:r>
-        <w:rPr>
-          <w:b w:val="0"/>
-        </w:rPr>
-        <w:t>. Tolerar um descumprimento uma vez não significa aceitar que se repita.</w:t>
+        <w:t>, sem aviso prévio, se houver: descumprimento do padrão de serviço após duas notificações escritas em 90 (noventa) dias; atraso nas obrigações trabalhistas ou fiscais da CONTRATADA; pessoa trabalhando sem formalização; furto, dano intencional, agressão, assédio, embriaguez ou uso de entorpecente em serviço; quebra de sigilo; descumprimento das regras da Casa de Operações; ou parada dos serviços por mais de 48 (quarenta e oito) horas sem justificativa.</w:t>
       </w:r>
     </w:p>
     <w:p>
@@ -2247,25 +2223,13 @@
         <w:rPr>
           <w:b/>
         </w:rPr>
-        <w:t>12.2. Aviso de mudança.</w:t>
+        <w:t>11.2.</w:t>
       </w:r>
       <w:r>
         <w:rPr>
           <w:b w:val="0"/>
         </w:rPr>
-        <w:t xml:space="preserve"> Qualquer mudança relevante nas condições deste contrato, no escopo dos serviços ou no uso das instalações deverá ser comunicada pela Parte interessada à outra </w:t>
-      </w:r>
-      <w:r>
-        <w:rPr>
-          <w:b/>
-        </w:rPr>
-        <w:t>por escrito e com 30 (trinta) dias de antecedência</w:t>
-      </w:r>
-      <w:r>
-        <w:rPr>
-          <w:b w:val="0"/>
-        </w:rPr>
-        <w:t>, admitida a notificação extrajudicial. A mudança só passa a valer após esse prazo e mediante aditivo assinado pelas duas Partes, salvo se ambas concordarem em antecipar.</w:t>
+        <w:t xml:space="preserve"> A CONTRATADA pode encerrar imediatamente se o pagamento atrasar mais de 30 (trinta) dias, estando sua documentação regular, após aviso com 10 (dez) dias para regularização.</w:t>
       </w:r>
     </w:p>
     <w:p>
@@ -2273,37 +2237,13 @@
         <w:rPr>
           <w:b/>
         </w:rPr>
-        <w:t>12.3.</w:t>
+        <w:t>11.3.</w:t>
       </w:r>
       <w:r>
         <w:rPr>
           <w:b w:val="0"/>
         </w:rPr>
-        <w:t xml:space="preserve"> As comunicações valem por escrito, por e-mail com confirmação: </w:t>
-      </w:r>
-      <w:r>
-        <w:rPr>
-          <w:b/>
-        </w:rPr>
-        <w:t>CONTRATANTE</w:t>
-      </w:r>
-      <w:r>
-        <w:rPr>
-          <w:b w:val="0"/>
-        </w:rPr>
-        <w:t xml:space="preserve"> — a.chaerk@gmail.com, (49) 9170-4545; </w:t>
-      </w:r>
-      <w:r>
-        <w:rPr>
-          <w:b/>
-        </w:rPr>
-        <w:t>CONTRATADA</w:t>
-      </w:r>
-      <w:r>
-        <w:rPr>
-          <w:b w:val="0"/>
-        </w:rPr>
-        <w:t xml:space="preserve"> — ilhadosabor.sc@gmail.com, +55 (48) 99223-2826.</w:t>
+        <w:t xml:space="preserve"> Encerrado o contrato: a cessão da casa termina junto (Cláusula 9.6); a CONTRATADA devolve em 48 (quarenta e oito) horas chaves, acessos e bens da CONTRATANTE; e as Partes acertam as contas em até 30 (trinta) dias.</w:t>
       </w:r>
     </w:p>
     <w:p>
@@ -2311,105 +2251,13 @@
         <w:rPr>
           <w:b/>
         </w:rPr>
-        <w:t>12.4.</w:t>
+        <w:t>11.4.</w:t>
       </w:r>
       <w:r>
         <w:rPr>
           <w:b w:val="0"/>
         </w:rPr>
-        <w:t xml:space="preserve"> Nenhuma das Partes pode transferir este contrato a terceiros sem a concordância da outra.</w:t>
-      </w:r>
-    </w:p>
-    <w:p>
-      <w:r>
-        <w:rPr>
-          <w:b/>
-        </w:rPr>
-        <w:t>12.5.</w:t>
-      </w:r>
-      <w:r>
-        <w:rPr>
-          <w:b w:val="0"/>
-        </w:rPr>
-        <w:t xml:space="preserve"> Se alguma cláusula for considerada inválida, as demais continuam valendo.</w:t>
-      </w:r>
-    </w:p>
-    <w:p>
-      <w:r>
-        <w:rPr>
-          <w:b/>
-        </w:rPr>
-        <w:t>12.6.</w:t>
-      </w:r>
-      <w:r>
-        <w:rPr>
-          <w:b w:val="0"/>
-        </w:rPr>
-        <w:t xml:space="preserve"> As Partes negociaram livremente estes termos, em contrato empresarial entre iguais (arts. 421, 421-A e 422 do Código Civil).</w:t>
-      </w:r>
-    </w:p>
-    <w:p>
-      <w:r>
-        <w:rPr>
-          <w:b/>
-        </w:rPr>
-        <w:t>12.7.</w:t>
-      </w:r>
-      <w:r>
-        <w:rPr>
-          <w:b w:val="0"/>
-        </w:rPr>
-        <w:t xml:space="preserve"> Assinado por duas testemunhas, este contrato é </w:t>
-      </w:r>
-      <w:r>
-        <w:rPr>
-          <w:b/>
-        </w:rPr>
-        <w:t>título executivo extrajudicial</w:t>
-      </w:r>
-      <w:r>
-        <w:rPr>
-          <w:b w:val="0"/>
-        </w:rPr>
-        <w:t xml:space="preserve"> (art. 784, III, do CPC). As Partes aceitam </w:t>
-      </w:r>
-      <w:r>
-        <w:rPr>
-          <w:b/>
-        </w:rPr>
-        <w:t>assinatura eletrônica</w:t>
-      </w:r>
-      <w:r>
-        <w:rPr>
-          <w:b w:val="0"/>
-        </w:rPr>
-        <w:t xml:space="preserve"> (MP nº 2.200-2/2001 e Lei nº 14.063/2020).</w:t>
-      </w:r>
-    </w:p>
-    <w:p>
-      <w:r>
-        <w:rPr>
-          <w:b/>
-        </w:rPr>
-        <w:t>12.8.</w:t>
-      </w:r>
-      <w:r>
-        <w:rPr>
-          <w:b w:val="0"/>
-        </w:rPr>
-        <w:t xml:space="preserve"> Fica eleito o foro de </w:t>
-      </w:r>
-      <w:r>
-        <w:rPr>
-          <w:b/>
-        </w:rPr>
-        <w:t>Florianópolis/SC</w:t>
-      </w:r>
-      <w:r>
-        <w:rPr>
-          <w:b w:val="0"/>
-        </w:rPr>
-        <w:t>.</w:t>
+        <w:t xml:space="preserve"> Encerramentos por descumprimento não afastam a responsabilidade pelos prejuízos causados.</w:t>
       </w:r>
     </w:p>
     <w:p>
@@ -2431,7 +2279,7 @@
           <w:color w:val="C9A84C"/>
           <w:sz w:val="25"/>
         </w:rPr>
-        <w:t>13. DECLARAÇÕES CONJUNTAS DAS PARTES</w:t>
+        <w:t>12. DISPOSIÇÕES FINAIS</w:t>
       </w:r>
     </w:p>
     <w:p>
@@ -2439,40 +2287,282 @@
         <w:rPr>
           <w:b/>
         </w:rPr>
-        <w:t>13.1.</w:t>
+        <w:t>12.1.</w:t>
       </w:r>
       <w:r>
         <w:rPr>
           <w:b w:val="0"/>
         </w:rPr>
-        <w:t xml:space="preserve"> As Partes declaram, de forma livre, consciente e de comum acordo, que:</w:t>
+        <w:t xml:space="preserve"> Este contrato, com o </w:t>
+      </w:r>
+      <w:r>
+        <w:rPr>
+          <w:b/>
+        </w:rPr>
+        <w:t>Plano de Cobertura</w:t>
+      </w:r>
+      <w:r>
+        <w:rPr>
+          <w:b w:val="0"/>
+        </w:rPr>
+        <w:t xml:space="preserve"> e o </w:t>
+      </w:r>
+      <w:r>
+        <w:rPr>
+          <w:b/>
+        </w:rPr>
+        <w:t>Recibo Mensal</w:t>
+      </w:r>
+      <w:r>
+        <w:rPr>
+          <w:b w:val="0"/>
+        </w:rPr>
+        <w:t xml:space="preserve"> anexos, reúne tudo o que foi combinado e só muda por </w:t>
+      </w:r>
+      <w:r>
+        <w:rPr>
+          <w:b/>
+        </w:rPr>
+        <w:t>aditivo escrito</w:t>
+      </w:r>
+      <w:r>
+        <w:rPr>
+          <w:b w:val="0"/>
+        </w:rPr>
+        <w:t>. Tolerar um descumprimento uma vez não significa aceitar que se repita.</w:t>
       </w:r>
     </w:p>
     <w:p>
       <w:r>
         <w:rPr>
+          <w:b/>
+        </w:rPr>
+        <w:t>12.2. Aviso de mudança.</w:t>
+      </w:r>
+      <w:r>
+        <w:rPr>
           <w:b w:val="0"/>
         </w:rPr>
-        <w:t xml:space="preserve">a) negociaram todos os termos deste contrato em </w:t>
+        <w:t xml:space="preserve"> Qualquer mudança relevante nas condições deste contrato, no escopo dos serviços ou no uso das instalações deverá ser comunicada pela Parte interessada à outra </w:t>
       </w:r>
       <w:r>
         <w:rPr>
           <w:b/>
         </w:rPr>
-        <w:t>igualdade de condições</w:t>
+        <w:t>por escrito e com 30 (trinta) dias de antecedência</w:t>
       </w:r>
       <w:r>
         <w:rPr>
           <w:b w:val="0"/>
         </w:rPr>
-        <w:t>, cada uma com plena compreensão do seu conteúdo, e que nenhuma cláusula lhes foi imposta;</w:t>
+        <w:t>, admitida a notificação extrajudicial. A mudança só passa a valer após esse prazo e mediante aditivo assinado pelas duas Partes, salvo se ambas concordarem em antecipar.</w:t>
       </w:r>
     </w:p>
     <w:p>
       <w:r>
         <w:rPr>
+          <w:b/>
+        </w:rPr>
+        <w:t>12.3.</w:t>
+      </w:r>
+      <w:r>
+        <w:rPr>
           <w:b w:val="0"/>
         </w:rPr>
+        <w:t xml:space="preserve"> As comunicações valem por escrito, por e-mail com confirmação: </w:t>
+      </w:r>
+      <w:r>
+        <w:rPr>
+          <w:b/>
+        </w:rPr>
+        <w:t>CONTRATANTE</w:t>
+      </w:r>
+      <w:r>
+        <w:rPr>
+          <w:b w:val="0"/>
+        </w:rPr>
+        <w:t xml:space="preserve"> — a.chaerk@gmail.com, (49) 9170-4545; </w:t>
+      </w:r>
+      <w:r>
+        <w:rPr>
+          <w:b/>
+        </w:rPr>
+        <w:t>CONTRATADA</w:t>
+      </w:r>
+      <w:r>
+        <w:rPr>
+          <w:b w:val="0"/>
+        </w:rPr>
+        <w:t xml:space="preserve"> — ilhadosabor.sc@gmail.com, +55 (48) 99223-2826.</w:t>
+      </w:r>
+    </w:p>
+    <w:p>
+      <w:r>
+        <w:rPr>
+          <w:b/>
+        </w:rPr>
+        <w:t>12.4.</w:t>
+      </w:r>
+      <w:r>
+        <w:rPr>
+          <w:b w:val="0"/>
+        </w:rPr>
+        <w:t xml:space="preserve"> Nenhuma das Partes pode transferir este contrato a terceiros sem a concordância da outra.</w:t>
+      </w:r>
+    </w:p>
+    <w:p>
+      <w:r>
+        <w:rPr>
+          <w:b/>
+        </w:rPr>
+        <w:t>12.5.</w:t>
+      </w:r>
+      <w:r>
+        <w:rPr>
+          <w:b w:val="0"/>
+        </w:rPr>
+        <w:t xml:space="preserve"> Se alguma cláusula for considerada inválida, as demais continuam valendo.</w:t>
+      </w:r>
+    </w:p>
+    <w:p>
+      <w:r>
+        <w:rPr>
+          <w:b/>
+        </w:rPr>
+        <w:t>12.6.</w:t>
+      </w:r>
+      <w:r>
+        <w:rPr>
+          <w:b w:val="0"/>
+        </w:rPr>
+        <w:t xml:space="preserve"> As Partes negociaram livremente estes termos, em contrato empresarial entre iguais (arts. 421, 421-A e 422 do Código Civil).</w:t>
+      </w:r>
+    </w:p>
+    <w:p>
+      <w:r>
+        <w:rPr>
+          <w:b/>
+        </w:rPr>
+        <w:t>12.7.</w:t>
+      </w:r>
+      <w:r>
+        <w:rPr>
+          <w:b w:val="0"/>
+        </w:rPr>
+        <w:t xml:space="preserve"> Assinado por duas testemunhas, este contrato é </w:t>
+      </w:r>
+      <w:r>
+        <w:rPr>
+          <w:b/>
+        </w:rPr>
+        <w:t>título executivo extrajudicial</w:t>
+      </w:r>
+      <w:r>
+        <w:rPr>
+          <w:b w:val="0"/>
+        </w:rPr>
+        <w:t xml:space="preserve"> (art. 784, III, do CPC). As Partes aceitam </w:t>
+      </w:r>
+      <w:r>
+        <w:rPr>
+          <w:b/>
+        </w:rPr>
+        <w:t>assinatura eletrônica</w:t>
+      </w:r>
+      <w:r>
+        <w:rPr>
+          <w:b w:val="0"/>
+        </w:rPr>
+        <w:t xml:space="preserve"> (MP nº 2.200-2/2001 e Lei nº 14.063/2020).</w:t>
+      </w:r>
+    </w:p>
+    <w:p>
+      <w:r>
+        <w:rPr>
+          <w:b/>
+        </w:rPr>
+        <w:t>12.8.</w:t>
+      </w:r>
+      <w:r>
+        <w:rPr>
+          <w:b w:val="0"/>
+        </w:rPr>
+        <w:t xml:space="preserve"> Fica eleito o foro de </w:t>
+      </w:r>
+      <w:r>
+        <w:rPr>
+          <w:b/>
+        </w:rPr>
+        <w:t>Florianópolis/SC</w:t>
+      </w:r>
+      <w:r>
+        <w:rPr>
+          <w:b w:val="0"/>
+        </w:rPr>
+        <w:t>.</w:t>
+      </w:r>
+    </w:p>
+    <w:p>
+      <w:pPr>
+        <w:pBdr>
+          <w:bottom w:val="single" w:sz="6" w:color="C9A84C"/>
+        </w:pBdr>
+      </w:pPr>
+    </w:p>
+    <w:p>
+      <w:pPr>
+        <w:keepNext/>
+        <w:spacing w:before="360" w:after="160"/>
+        <w:jc w:val="left"/>
+      </w:pPr>
+      <w:r>
+        <w:rPr>
+          <w:b/>
+          <w:color w:val="C9A84C"/>
+          <w:sz w:val="25"/>
+        </w:rPr>
+        <w:t>13. DECLARAÇÕES CONJUNTAS DAS PARTES</w:t>
+      </w:r>
+    </w:p>
+    <w:p>
+      <w:r>
+        <w:rPr>
+          <w:b/>
+        </w:rPr>
+        <w:t>13.1.</w:t>
+      </w:r>
+      <w:r>
+        <w:rPr>
+          <w:b w:val="0"/>
+        </w:rPr>
+        <w:t xml:space="preserve"> As Partes declaram, de forma livre, consciente e de comum acordo, que:</w:t>
+      </w:r>
+    </w:p>
+    <w:p>
+      <w:r>
+        <w:rPr>
+          <w:b w:val="0"/>
+        </w:rPr>
+        <w:t xml:space="preserve">a) negociaram todos os termos deste contrato em </w:t>
+      </w:r>
+      <w:r>
+        <w:rPr>
+          <w:b/>
+        </w:rPr>
+        <w:t>igualdade de condições</w:t>
+      </w:r>
+      <w:r>
+        <w:rPr>
+          <w:b w:val="0"/>
+        </w:rPr>
+        <w:t>, cada uma com plena compreensão do seu conteúdo, e que nenhuma cláusula lhes foi imposta;</w:t>
+      </w:r>
+    </w:p>
+    <w:p>
+      <w:r>
+        <w:rPr>
+          <w:b w:val="0"/>
+        </w:rPr>
         <w:t xml:space="preserve">b) a relação entre elas é </w:t>
       </w:r>
       <w:r>
@@ -2485,7 +2575,19 @@
         <w:rPr>
           <w:b w:val="0"/>
         </w:rPr>
-        <w:t>, e não de emprego: a CONTRATADA organiza seu trabalho como entende, sem dia ou horário fixo para qualquer pessoa, podendo se fazer substituir e atender outros clientes;</w:t>
+        <w:t xml:space="preserve">, e não de emprego: a CONTRATADA </w:t>
+      </w:r>
+      <w:r>
+        <w:rPr>
+          <w:b/>
+        </w:rPr>
+        <w:t>supervisiona, controla e responde pela operação</w:t>
+      </w:r>
+      <w:r>
+        <w:rPr>
+          <w:b w:val="0"/>
+        </w:rPr>
+        <w:t xml:space="preserve"> no escopo contratado, organiza seu trabalho como entende, sem dia ou horário fixo para qualquer pessoa, podendo se fazer substituir e atender outros clientes;</w:t>
       </w:r>
     </w:p>
     <w:p>

</xml_diff>

<commit_message>
Corrige o escopo da Contratada e registra a opção pela pessoa jurídica
A Cláusula 1.5 atribuía à Contratada a supervisão e o controle da
operação, o que não corresponde à realidade: quem supervisiona é a
Contratante. Descrever no contrato o que não acontece enfraquece o
documento.

- 1.5 passa a tratar da execução dos serviços, com autonomia sobre
  equipe, método e ordem de execução, e responsabilidade pela qualidade.
- 1.5.1 atribui à Contratante a gestão do negócio e a definição do
  padrão e da programação diária.
- A declaração conjunta deixa de mencionar supervisão.
- Nova alínea g: a contratação sob a forma de pessoa jurídica foi
  proposta e escolhida pela própria Contratada, com conhecimento das
  alternativas.

Co-Authored-By: Claude Opus 5 <noreply@anthropic.com>
Claude-Session: https://claude.ai/code/session_01JvuJwy7yY4EnoYMkQynCaG
</commit_message>
<xml_diff>
--- a/docs/juridico/contrato-leve-zeladoria.docx
+++ b/docs/juridico/contrato-leve-zeladoria.docx
@@ -259,25 +259,73 @@
         <w:rPr>
           <w:b/>
         </w:rPr>
-        <w:t>1.5. Supervisão, controle e execução.</w:t>
+        <w:t>1.5. Execução dos serviços.</w:t>
       </w:r>
       <w:r>
         <w:rPr>
           <w:b w:val="0"/>
         </w:rPr>
-        <w:t xml:space="preserve"> Cabe à CONTRATADA </w:t>
+        <w:t xml:space="preserve"> A CONTRATADA </w:t>
       </w:r>
       <w:r>
         <w:rPr>
           <w:b/>
         </w:rPr>
-        <w:t>supervisionar, controlar e executar</w:t>
+        <w:t>executa</w:t>
       </w:r>
       <w:r>
         <w:rPr>
           <w:b w:val="0"/>
         </w:rPr>
-        <w:t>, por sua conta e no exercício de sua autonomia, tudo o que for necessário à entrega dos serviços deste contrato: a organização e a direção da própria equipe; o padrão e a qualidade do que é entregue; as rotinas de trabalho e a ordem de execução; o controle dos insumos, do enxoval e dos materiais sob sua guarda; o atendimento ao hóspede no que lhe compete; a conservação das instalações; e a verificação diária de que o empreendimento está em condições de receber e manter hóspedes.</w:t>
+        <w:t xml:space="preserve"> os serviços da Cláusula 1.2 — recepção, check-in e check-out, limpeza e arrumação, entrega de café da manhã e lanches, conservação e apoio operacional —, organizando por sua conta a </w:t>
+      </w:r>
+      <w:r>
+        <w:rPr>
+          <w:b/>
+        </w:rPr>
+        <w:t>equipe</w:t>
+      </w:r>
+      <w:r>
+        <w:rPr>
+          <w:b w:val="0"/>
+        </w:rPr>
+        <w:t xml:space="preserve">, o </w:t>
+      </w:r>
+      <w:r>
+        <w:rPr>
+          <w:b/>
+        </w:rPr>
+        <w:t>método</w:t>
+      </w:r>
+      <w:r>
+        <w:rPr>
+          <w:b w:val="0"/>
+        </w:rPr>
+        <w:t xml:space="preserve"> e a </w:t>
+      </w:r>
+      <w:r>
+        <w:rPr>
+          <w:b/>
+        </w:rPr>
+        <w:t>ordem de execução</w:t>
+      </w:r>
+      <w:r>
+        <w:rPr>
+          <w:b w:val="0"/>
+        </w:rPr>
+        <w:t xml:space="preserve">, e respondendo pela </w:t>
+      </w:r>
+      <w:r>
+        <w:rPr>
+          <w:b/>
+        </w:rPr>
+        <w:t>qualidade e pelo padrão</w:t>
+      </w:r>
+      <w:r>
+        <w:rPr>
+          <w:b w:val="0"/>
+        </w:rPr>
+        <w:t xml:space="preserve"> do que entrega.</w:t>
       </w:r>
     </w:p>
     <w:p>
@@ -291,31 +339,19 @@
         <w:rPr>
           <w:b w:val="0"/>
         </w:rPr>
-        <w:t xml:space="preserve"> A CONTRATADA é a </w:t>
+        <w:t xml:space="preserve"> A </w:t>
       </w:r>
       <w:r>
         <w:rPr>
           <w:b/>
         </w:rPr>
-        <w:t>responsável pelo resultado</w:t>
+        <w:t>gestão do negócio</w:t>
       </w:r>
       <w:r>
         <w:rPr>
           <w:b w:val="0"/>
         </w:rPr>
-        <w:t xml:space="preserve"> da operação dentro do escopo contratado e responde por sua condução perante a CONTRATANTE. Obriga-se a </w:t>
-      </w:r>
-      <w:r>
-        <w:rPr>
-          <w:b/>
-        </w:rPr>
-        <w:t>comunicar de imediato</w:t>
-      </w:r>
-      <w:r>
-        <w:rPr>
-          <w:b w:val="0"/>
-        </w:rPr>
-        <w:t xml:space="preserve"> o que estiver fora da sua alçada: falha que exija profissional habilitado, ocorrência de segurança, dano relevante, risco a hóspede ou situação que dependa de decisão da CONTRATANTE.</w:t>
+        <w:t xml:space="preserve"> é conduzida pela CONTRATANTE: preços e tarifas, política de reservas e cancelamento, cortesias e descontos, escolha e contratação de fornecedores, investimentos e obras, representação perante terceiros, definição do padrão de serviço e a programação diária de que trata a Cláusula 3.</w:t>
       </w:r>
     </w:p>
     <w:p>
@@ -329,19 +365,7 @@
         <w:rPr>
           <w:b w:val="0"/>
         </w:rPr>
-        <w:t xml:space="preserve"> Permanecem com a CONTRATANTE as </w:t>
-      </w:r>
-      <w:r>
-        <w:rPr>
-          <w:b/>
-        </w:rPr>
-        <w:t>decisões de negócio</w:t>
-      </w:r>
-      <w:r>
-        <w:rPr>
-          <w:b w:val="0"/>
-        </w:rPr>
-        <w:t>: preços e tarifas, política de reservas e cancelamento, cortesias e descontos, escolha e contratação de fornecedores, investimentos e obras, e a representação do empreendimento perante terceiros.</w:t>
+        <w:t xml:space="preserve"> A CONTRATADA comunica de imediato à CONTRATANTE o que estiver fora do seu escopo: falha que exija profissional habilitado, ocorrência de segurança, dano relevante ou risco a hóspede.</w:t>
       </w:r>
     </w:p>
     <w:p>
@@ -2575,19 +2599,7 @@
         <w:rPr>
           <w:b w:val="0"/>
         </w:rPr>
-        <w:t xml:space="preserve">, e não de emprego: a CONTRATADA </w:t>
-      </w:r>
-      <w:r>
-        <w:rPr>
-          <w:b/>
-        </w:rPr>
-        <w:t>supervisiona, controla e responde pela operação</w:t>
-      </w:r>
-      <w:r>
-        <w:rPr>
-          <w:b w:val="0"/>
-        </w:rPr>
-        <w:t xml:space="preserve"> no escopo contratado, organiza seu trabalho como entende, sem dia ou horário fixo para qualquer pessoa, podendo se fazer substituir e atender outros clientes;</w:t>
+        <w:t>, e não de emprego: a CONTRATADA organiza a própria equipe e o próprio método, sem dia ou horário fixo para qualquer pessoa, podendo se fazer substituir e atender outros clientes;</w:t>
       </w:r>
     </w:p>
     <w:p>
@@ -2687,7 +2699,27 @@
         <w:rPr>
           <w:b w:val="0"/>
         </w:rPr>
-        <w:t xml:space="preserve">g) este contrato é firmado </w:t>
+        <w:t xml:space="preserve">g) a contratação sob a forma de </w:t>
+      </w:r>
+      <w:r>
+        <w:rPr>
+          <w:b/>
+        </w:rPr>
+        <w:t>pessoa jurídica foi proposta e escolhida pela própria CONTRATADA</w:t>
+      </w:r>
+      <w:r>
+        <w:rPr>
+          <w:b w:val="0"/>
+        </w:rPr>
+        <w:t>, que declara ter optado livremente por essa modalidade, com conhecimento das alternativas existentes, por ser a que melhor atende aos seus interesses e à sua atividade empresarial;</w:t>
+      </w:r>
+    </w:p>
+    <w:p>
+      <w:r>
+        <w:rPr>
+          <w:b w:val="0"/>
+        </w:rPr>
+        <w:t xml:space="preserve">h) este contrato é firmado </w:t>
       </w:r>
       <w:r>
         <w:rPr>

</xml_diff>